<commit_message>
2026 July 28 touch-ups
</commit_message>
<xml_diff>
--- a/Victor Danilchenko Resume.docx
+++ b/Victor Danilchenko Resume.docx
@@ -1,6 +1,6 @@
 
 <file path=word/document.xml><?xml version="1.0" encoding="utf-8"?>
-<w:document xmlns:wpc="http://schemas.microsoft.com/office/word/2010/wordprocessingCanvas" xmlns:cx="http://schemas.microsoft.com/office/drawing/2014/chartex" xmlns:cx1="http://schemas.microsoft.com/office/drawing/2015/9/8/chartex" xmlns:cx2="http://schemas.microsoft.com/office/drawing/2015/10/21/chartex" xmlns:cx3="http://schemas.microsoft.com/office/drawing/2016/5/9/chartex" xmlns:cx4="http://schemas.microsoft.com/office/drawing/2016/5/10/chartex" xmlns:cx5="http://schemas.microsoft.com/office/drawing/2016/5/11/chartex" xmlns:cx6="http://schemas.microsoft.com/office/drawing/2016/5/12/chartex" xmlns:cx7="http://schemas.microsoft.com/office/drawing/2016/5/13/chartex" xmlns:cx8="http://schemas.microsoft.com/office/drawing/2016/5/14/chartex" xmlns:mc="http://schemas.openxmlformats.org/markup-compatibility/2006" xmlns:aink="http://schemas.microsoft.com/office/drawing/2016/ink" xmlns:am3d="http://schemas.microsoft.com/office/drawing/2017/model3d" xmlns:o="urn:schemas-microsoft-com:office:office" xmlns:oel="http://schemas.microsoft.com/office/2019/extlst" xmlns:r="http://schemas.openxmlformats.org/officeDocument/2006/relationships" xmlns:m="http://schemas.openxmlformats.org/officeDocument/2006/math" xmlns:v="urn:schemas-microsoft-com:vml" xmlns:wp14="http://schemas.microsoft.com/office/word/2010/wordprocessingDrawing" xmlns:wp="http://schemas.openxmlformats.org/drawingml/2006/wordprocessingDrawing" xmlns:w10="urn:schemas-microsoft-com:office:word" xmlns:w="http://schemas.openxmlformats.org/wordprocessingml/2006/main" xmlns:w14="http://schemas.microsoft.com/office/word/2010/wordml" xmlns:w15="http://schemas.microsoft.com/office/word/2012/wordml" xmlns:w16cex="http://schemas.microsoft.com/office/word/2018/wordml/cex" xmlns:w16cid="http://schemas.microsoft.com/office/word/2016/wordml/cid" xmlns:w16="http://schemas.microsoft.com/office/word/2018/wordml" xmlns:w16du="http://schemas.microsoft.com/office/word/2023/wordml/word16du" xmlns:w16sdtdh="http://schemas.microsoft.com/office/word/2020/wordml/sdtdatahash" xmlns:w16sdtfl="http://schemas.microsoft.com/office/word/2024/wordml/sdtformatlock" xmlns:w16se="http://schemas.microsoft.com/office/word/2015/wordml/symex" xmlns:wpg="http://schemas.microsoft.com/office/word/2010/wordprocessingGroup" xmlns:wpi="http://schemas.microsoft.com/office/word/2010/wordprocessingInk" xmlns:wne="http://schemas.microsoft.com/office/word/2006/wordml" xmlns:wps="http://schemas.microsoft.com/office/word/2010/wordprocessingShape" mc:Ignorable="w14 w15 w16se w16cid w16 w16cex w16sdtdh w16sdtfl w16du wp14">
+<w:document xmlns:wpc="http://schemas.microsoft.com/office/word/2010/wordprocessingCanvas" xmlns:cx="http://schemas.microsoft.com/office/drawing/2014/chartex" xmlns:cx1="http://schemas.microsoft.com/office/drawing/2015/9/8/chartex" xmlns:cx2="http://schemas.microsoft.com/office/drawing/2015/10/21/chartex" xmlns:cx3="http://schemas.microsoft.com/office/drawing/2016/5/9/chartex" xmlns:cx4="http://schemas.microsoft.com/office/drawing/2016/5/10/chartex" xmlns:cx5="http://schemas.microsoft.com/office/drawing/2016/5/11/chartex" xmlns:cx6="http://schemas.microsoft.com/office/drawing/2016/5/12/chartex" xmlns:cx7="http://schemas.microsoft.com/office/drawing/2016/5/13/chartex" xmlns:cx8="http://schemas.microsoft.com/office/drawing/2016/5/14/chartex" xmlns:mc="http://schemas.openxmlformats.org/markup-compatibility/2006" xmlns:aink="http://schemas.microsoft.com/office/drawing/2016/ink" xmlns:am3d="http://schemas.microsoft.com/office/drawing/2017/model3d" xmlns:o="urn:schemas-microsoft-com:office:office" xmlns:oel="http://schemas.microsoft.com/office/2019/extlst" xmlns:r="http://schemas.openxmlformats.org/officeDocument/2006/relationships" xmlns:m="http://schemas.openxmlformats.org/officeDocument/2006/math" xmlns:v="urn:schemas-microsoft-com:vml" xmlns:wp14="http://schemas.microsoft.com/office/word/2010/wordprocessingDrawing" xmlns:wp="http://schemas.openxmlformats.org/drawingml/2006/wordprocessingDrawing" xmlns:w10="urn:schemas-microsoft-com:office:word" xmlns:w="http://schemas.openxmlformats.org/wordprocessingml/2006/main" xmlns:w14="http://schemas.microsoft.com/office/word/2010/wordml" xmlns:w15="http://schemas.microsoft.com/office/word/2012/wordml" xmlns:w16cei="http://schemas.microsoft.com/office/word/2026/wordml/cei" xmlns:w16cex="http://schemas.microsoft.com/office/word/2018/wordml/cex" xmlns:w16cid="http://schemas.microsoft.com/office/word/2016/wordml/cid" xmlns:w16="http://schemas.microsoft.com/office/word/2018/wordml" xmlns:w16du="http://schemas.microsoft.com/office/word/2023/wordml/word16du" xmlns:w16sdtdh="http://schemas.microsoft.com/office/word/2020/wordml/sdtdatahash" xmlns:w16sdtfl="http://schemas.microsoft.com/office/word/2024/wordml/sdtformatlock" xmlns:w16se="http://schemas.microsoft.com/office/word/2015/wordml/symex" xmlns:wpg="http://schemas.microsoft.com/office/word/2010/wordprocessingGroup" xmlns:wpi="http://schemas.microsoft.com/office/word/2010/wordprocessingInk" xmlns:wne="http://schemas.microsoft.com/office/word/2006/wordml" xmlns:wps="http://schemas.microsoft.com/office/word/2010/wordprocessingShape" mc:Ignorable="w14 w15 w16se w16cid w16 w16cex w16sdtdh w16sdtfl w16du wp14">
   <w:body>
     <w:tbl>
       <w:tblPr>
@@ -17,16 +17,13 @@
         <w:tblLook w:val="04A0" w:firstRow="1" w:lastRow="0" w:firstColumn="1" w:lastColumn="0" w:noHBand="0" w:noVBand="1"/>
       </w:tblPr>
       <w:tblGrid>
-        <w:gridCol w:w="990"/>
-        <w:gridCol w:w="4237"/>
-        <w:gridCol w:w="2223"/>
+        <w:gridCol w:w="7450"/>
         <w:gridCol w:w="3004"/>
       </w:tblGrid>
       <w:tr>
         <w:tc>
           <w:tcPr>
             <w:tcW w:w="7450" w:type="dxa"/>
-            <w:gridSpan w:val="3"/>
             <w:tcBorders>
               <w:bottom w:val="single" w:sz="16" w:space="0" w:color="23201C"/>
             </w:tcBorders>
@@ -43,16 +40,12 @@
               <w:keepNext/>
               <w:keepLines/>
               <w:spacing w:after="110" w:line="630" w:lineRule="exact"/>
-              <w:rPr>
-                <w:lang w:val="pt-BR"/>
-              </w:rPr>
             </w:pPr>
             <w:r>
               <w:rPr>
                 <w:rFonts w:ascii="Spectral Light" w:eastAsia="Spectral Light" w:hAnsi="Spectral Light" w:cs="Spectral Light"/>
                 <w:color w:val="23201C"/>
                 <w:sz w:val="60"/>
-                <w:lang w:val="pt-BR"/>
               </w:rPr>
               <w:t>Victor Danilchenko</w:t>
             </w:r>
@@ -63,18 +56,38 @@
               <w:keepLines/>
               <w:spacing w:after="48" w:line="248" w:lineRule="exact"/>
               <w:rPr>
-                <w:lang w:val="pt-BR"/>
+                <w:spacing w:val="40"/>
               </w:rPr>
             </w:pPr>
+            <w:proofErr w:type="gramStart"/>
             <w:r>
               <w:rPr>
                 <w:b/>
                 <w:color w:val="2C4A66"/>
+                <w:spacing w:val="40"/>
                 <w:sz w:val="18"/>
-                <w:lang w:val="pt-BR"/>
               </w:rPr>
-              <w:t>D I S T I N G U I S H E D   A R C H I T E C T</w:t>
+              <w:t xml:space="preserve">DISTINGUISHED </w:t>
             </w:r>
+            <w:r>
+              <w:rPr>
+                <w:b/>
+                <w:color w:val="2C4A66"/>
+                <w:spacing w:val="40"/>
+                <w:sz w:val="18"/>
+              </w:rPr>
+              <w:t xml:space="preserve"> </w:t>
+            </w:r>
+            <w:r>
+              <w:rPr>
+                <w:b/>
+                <w:color w:val="2C4A66"/>
+                <w:spacing w:val="40"/>
+                <w:sz w:val="18"/>
+              </w:rPr>
+              <w:t>ARCHITECT</w:t>
+            </w:r>
+            <w:proofErr w:type="gramEnd"/>
           </w:p>
           <w:p>
             <w:pPr>
@@ -220,19 +233,18 @@
       </w:r>
       <w:r>
         <w:rPr>
-          <w:rFonts w:ascii="IBM Plex Sans" w:hAnsi="IBM Plex Sans" w:eastAsia="IBM Plex Sans" w:cs="IBM Plex Sans"/>
-          <w:sz w:val="17"/>
+          <w:rFonts w:ascii="IBM Plex Sans" w:eastAsia="IBM Plex Sans" w:hAnsi="IBM Plex Sans" w:cs="IBM Plex Sans"/>
         </w:rPr>
         <w:tab/>
       </w:r>
       <w:r>
         <w:rPr>
           <w:color w:val="DDD8D0"/>
+          <w:position w:val="5"/>
           <w:sz w:val="18"/>
-          <w:position w:val="5"/>
         </w:rPr>
         <w:tab/>
-        <w:t xml:space="preserve"> </w:t>
+        <w:t> </w:t>
       </w:r>
     </w:p>
     <w:tbl>
@@ -241,7 +253,7 @@
         <w:tblBorders>
           <w:top w:val="nil"/>
           <w:left w:val="nil"/>
-          <w:bottom w:val="single" w:sz="16" w:space="0" w:color="23201C"/>
+          <w:bottom w:val="nil"/>
           <w:right w:val="nil"/>
           <w:insideH w:val="nil"/>
           <w:insideV w:val="nil"/>
@@ -250,24 +262,16 @@
         <w:tblLook w:val="04A0" w:firstRow="1" w:lastRow="0" w:firstColumn="1" w:lastColumn="0" w:noHBand="0" w:noVBand="1"/>
       </w:tblPr>
       <w:tblGrid>
-        <w:gridCol w:w="990"/>
-        <w:gridCol w:w="4237"/>
-        <w:gridCol w:w="2223"/>
-        <w:gridCol w:w="3004"/>
+        <w:gridCol w:w="5227"/>
+        <w:gridCol w:w="5227"/>
       </w:tblGrid>
       <w:tr>
-        <w:tblPrEx>
-          <w:tblBorders>
-            <w:bottom w:val="nil"/>
-          </w:tblBorders>
-        </w:tblPrEx>
         <w:trPr>
           <w:cantSplit/>
         </w:trPr>
         <w:tc>
           <w:tcPr>
             <w:tcW w:w="5227" w:type="dxa"/>
-            <w:gridSpan w:val="2"/>
             <w:tcMar>
               <w:top w:w="0" w:type="dxa"/>
               <w:left w:w="0" w:type="dxa"/>
@@ -288,7 +292,6 @@
         <w:tc>
           <w:tcPr>
             <w:tcW w:w="5227" w:type="dxa"/>
-            <w:gridSpan w:val="2"/>
             <w:tcMar>
               <w:top w:w="0" w:type="dxa"/>
               <w:left w:w="190" w:type="dxa"/>
@@ -308,7 +311,15 @@
               <w:t xml:space="preserve">grounded in </w:t>
             </w:r>
             <w:r>
-              <w:t>a practical understanding of how large organizations actually get things done.</w:t>
+              <w:t xml:space="preserve">a practical understanding of how large organizations </w:t>
+            </w:r>
+            <w:proofErr w:type="gramStart"/>
+            <w:r>
+              <w:t>actually get</w:t>
+            </w:r>
+            <w:proofErr w:type="gramEnd"/>
+            <w:r>
+              <w:t xml:space="preserve"> things done.</w:t>
             </w:r>
           </w:p>
         </w:tc>
@@ -335,7 +346,29 @@
           <w:sz w:val="24"/>
           <w:szCs w:val="24"/>
         </w:rPr>
-        <w:t>This is how I move complex enterprise initiatives from “this is a mess, how do we even begin?” to “it is in production.”</w:t>
+        <w:t xml:space="preserve">This is how I move complex enterprise initiatives from “this is a </w:t>
+      </w:r>
+      <w:proofErr w:type="gramStart"/>
+      <w:r>
+        <w:rPr>
+          <w:rFonts w:ascii="Spectral Light" w:eastAsia="Spectral Light" w:hAnsi="Spectral Light" w:cs="Spectral Light"/>
+          <w:i/>
+          <w:color w:val="23201C"/>
+          <w:sz w:val="24"/>
+          <w:szCs w:val="24"/>
+        </w:rPr>
+        <w:t>mess,</w:t>
+      </w:r>
+      <w:proofErr w:type="gramEnd"/>
+      <w:r>
+        <w:rPr>
+          <w:rFonts w:ascii="Spectral Light" w:eastAsia="Spectral Light" w:hAnsi="Spectral Light" w:cs="Spectral Light"/>
+          <w:i/>
+          <w:color w:val="23201C"/>
+          <w:sz w:val="24"/>
+          <w:szCs w:val="24"/>
+        </w:rPr>
+        <w:t xml:space="preserve"> how do we even begin?” to “it is in production.”</w:t>
       </w:r>
     </w:p>
     <w:p>
@@ -356,19 +389,18 @@
       </w:r>
       <w:r>
         <w:rPr>
-          <w:rFonts w:ascii="IBM Plex Sans" w:hAnsi="IBM Plex Sans" w:eastAsia="IBM Plex Sans" w:cs="IBM Plex Sans"/>
-          <w:sz w:val="17"/>
+          <w:rFonts w:ascii="IBM Plex Sans" w:eastAsia="IBM Plex Sans" w:hAnsi="IBM Plex Sans" w:cs="IBM Plex Sans"/>
         </w:rPr>
         <w:tab/>
       </w:r>
       <w:r>
         <w:rPr>
           <w:color w:val="DDD8D0"/>
+          <w:position w:val="5"/>
           <w:sz w:val="18"/>
-          <w:position w:val="5"/>
         </w:rPr>
         <w:tab/>
-        <w:t xml:space="preserve"> </w:t>
+        <w:t> </w:t>
       </w:r>
     </w:p>
     <w:p>
@@ -440,17 +472,33 @@
         <w:pBdr>
           <w:left w:val="single" w:sz="6" w:space="11" w:color="E4E0D8"/>
         </w:pBdr>
-        <w:spacing w:after="0"/>
-        <w:ind w:left="504" w:right="1440"/>
+        <w:spacing w:after="80" w:line="240" w:lineRule="exact"/>
+        <w:ind w:left="504" w:right="1296"/>
+        <w:rPr>
+          <w:sz w:val="18"/>
+          <w:szCs w:val="18"/>
+        </w:rPr>
       </w:pPr>
       <w:r>
-        <w:t xml:space="preserve">Designed a multi-domain </w:t>
+        <w:rPr>
+          <w:sz w:val="18"/>
+          <w:szCs w:val="18"/>
+        </w:rPr>
+        <w:t xml:space="preserve">Built a technical screening framework that </w:t>
       </w:r>
       <w:r>
-        <w:t xml:space="preserve">regulatory </w:t>
+        <w:rPr>
+          <w:sz w:val="18"/>
+          <w:szCs w:val="18"/>
+        </w:rPr>
+        <w:t>reduced</w:t>
       </w:r>
       <w:r>
-        <w:t>compliance modernization strategy aligned with Enterprise Architecture</w:t>
+        <w:rPr>
+          <w:sz w:val="18"/>
+          <w:szCs w:val="18"/>
+        </w:rPr>
+        <w:t xml:space="preserve"> unsuitable candidates advancing to interviews by 50%</w:t>
       </w:r>
     </w:p>
     <w:p>
@@ -463,61 +511,18 @@
         <w:pBdr>
           <w:left w:val="single" w:sz="6" w:space="11" w:color="E4E0D8"/>
         </w:pBdr>
-        <w:spacing w:after="0"/>
-        <w:ind w:left="504" w:right="1440"/>
+        <w:spacing w:after="80" w:line="240" w:lineRule="exact"/>
+        <w:ind w:left="504" w:right="1296"/>
+        <w:rPr>
+          <w:sz w:val="18"/>
+          <w:szCs w:val="18"/>
+        </w:rPr>
       </w:pPr>
       <w:r>
-        <w:t>Led SOX compliance modernization for 1,700+ applications, migrating them to a unified compliance platform</w:t>
-      </w:r>
-    </w:p>
-    <w:p>
-      <w:pPr>
-        <w:pStyle w:val="ResumeBullet"/>
-        <w:numPr>
-          <w:ilvl w:val="0"/>
-          <w:numId w:val="1"/>
-        </w:numPr>
-        <w:pBdr>
-          <w:left w:val="single" w:sz="6" w:space="11" w:color="E4E0D8"/>
-        </w:pBdr>
-        <w:spacing w:after="0"/>
-        <w:ind w:left="504" w:right="1440"/>
-      </w:pPr>
-      <w:r>
-        <w:t>Defined an integration identity model for 9,000+ enterprise applications &amp; 32 business process domains spanning security, compliance, operations, finance, and strategy</w:t>
-      </w:r>
-    </w:p>
-    <w:p>
-      <w:pPr>
-        <w:pStyle w:val="ResumeBullet"/>
-        <w:numPr>
-          <w:ilvl w:val="0"/>
-          <w:numId w:val="1"/>
-        </w:numPr>
-        <w:pBdr>
-          <w:left w:val="single" w:sz="6" w:space="11" w:color="E4E0D8"/>
-        </w:pBdr>
-        <w:spacing w:after="0"/>
-        <w:ind w:left="504" w:right="1440"/>
-      </w:pPr>
-      <w:r>
-        <w:t>Built a structured technical-screening framework that reduced unsuitable candidates advanced to interviews by 50%</w:t>
-      </w:r>
-    </w:p>
-    <w:p>
-      <w:pPr>
-        <w:pStyle w:val="ResumeBullet"/>
-        <w:numPr>
-          <w:ilvl w:val="0"/>
-          <w:numId w:val="1"/>
-        </w:numPr>
-        <w:pBdr>
-          <w:left w:val="single" w:sz="6" w:space="11" w:color="E4E0D8"/>
-        </w:pBdr>
-        <w:spacing w:after="0"/>
-        <w:ind w:left="504" w:right="1440"/>
-      </w:pPr>
-      <w:r>
+        <w:rPr>
+          <w:sz w:val="18"/>
+          <w:szCs w:val="18"/>
+        </w:rPr>
         <w:t>Defining an application modernization strategy and readiness assessment framework</w:t>
       </w:r>
     </w:p>
@@ -531,11 +536,33 @@
         <w:pBdr>
           <w:left w:val="single" w:sz="6" w:space="11" w:color="E4E0D8"/>
         </w:pBdr>
-        <w:spacing w:after="0"/>
-        <w:ind w:left="504" w:right="1440"/>
+        <w:spacing w:after="80" w:line="240" w:lineRule="exact"/>
+        <w:ind w:left="504" w:right="1296"/>
+        <w:rPr>
+          <w:sz w:val="18"/>
+          <w:szCs w:val="18"/>
+        </w:rPr>
       </w:pPr>
       <w:r>
-        <w:t>Designing a cross-domain business value modeling &amp; strategy framework for business architecture</w:t>
+        <w:rPr>
+          <w:sz w:val="18"/>
+          <w:szCs w:val="18"/>
+        </w:rPr>
+        <w:t xml:space="preserve">Designing a cross-domain business value modeling </w:t>
+      </w:r>
+      <w:r>
+        <w:rPr>
+          <w:sz w:val="18"/>
+          <w:szCs w:val="18"/>
+        </w:rPr>
+        <w:t>and</w:t>
+      </w:r>
+      <w:r>
+        <w:rPr>
+          <w:sz w:val="18"/>
+          <w:szCs w:val="18"/>
+        </w:rPr>
+        <w:t xml:space="preserve"> strategy framework for business architecture</w:t>
       </w:r>
     </w:p>
     <w:p>
@@ -579,10 +606,135 @@
         <w:pBdr>
           <w:left w:val="single" w:sz="6" w:space="11" w:color="E4E0D8"/>
         </w:pBdr>
-        <w:spacing w:after="0"/>
+        <w:spacing w:after="80" w:line="240" w:lineRule="exact"/>
         <w:ind w:left="504" w:right="1440"/>
+        <w:rPr>
+          <w:sz w:val="18"/>
+          <w:szCs w:val="18"/>
+        </w:rPr>
       </w:pPr>
       <w:r>
+        <w:rPr>
+          <w:sz w:val="18"/>
+          <w:szCs w:val="18"/>
+        </w:rPr>
+        <w:t>Designed a multi-domain regulatory compliance modernization strategy</w:t>
+      </w:r>
+    </w:p>
+    <w:p>
+      <w:pPr>
+        <w:pStyle w:val="ResumeBullet"/>
+        <w:numPr>
+          <w:ilvl w:val="0"/>
+          <w:numId w:val="1"/>
+        </w:numPr>
+        <w:pBdr>
+          <w:left w:val="single" w:sz="6" w:space="11" w:color="E4E0D8"/>
+        </w:pBdr>
+        <w:spacing w:after="80" w:line="240" w:lineRule="exact"/>
+        <w:ind w:left="504" w:right="1440"/>
+        <w:rPr>
+          <w:sz w:val="18"/>
+          <w:szCs w:val="18"/>
+        </w:rPr>
+      </w:pPr>
+      <w:r>
+        <w:rPr>
+          <w:sz w:val="18"/>
+          <w:szCs w:val="18"/>
+        </w:rPr>
+        <w:t>Led SOX compliance modernization for 1,700+ applications, migrating them to a unified platform</w:t>
+      </w:r>
+    </w:p>
+    <w:p>
+      <w:pPr>
+        <w:pStyle w:val="ResumeBullet"/>
+        <w:numPr>
+          <w:ilvl w:val="0"/>
+          <w:numId w:val="1"/>
+        </w:numPr>
+        <w:pBdr>
+          <w:left w:val="single" w:sz="6" w:space="11" w:color="E4E0D8"/>
+        </w:pBdr>
+        <w:spacing w:after="80" w:line="240" w:lineRule="exact"/>
+        <w:ind w:left="504" w:right="1440"/>
+        <w:rPr>
+          <w:sz w:val="18"/>
+          <w:szCs w:val="18"/>
+        </w:rPr>
+      </w:pPr>
+      <w:r>
+        <w:rPr>
+          <w:sz w:val="18"/>
+          <w:szCs w:val="18"/>
+        </w:rPr>
+        <w:t xml:space="preserve">Defined an integration identity model for </w:t>
+      </w:r>
+      <w:r>
+        <w:rPr>
+          <w:sz w:val="18"/>
+          <w:szCs w:val="18"/>
+        </w:rPr>
+        <w:t>the</w:t>
+      </w:r>
+      <w:r>
+        <w:rPr>
+          <w:sz w:val="18"/>
+          <w:szCs w:val="18"/>
+        </w:rPr>
+        <w:t xml:space="preserve"> enterprise application</w:t>
+      </w:r>
+      <w:r>
+        <w:rPr>
+          <w:sz w:val="18"/>
+          <w:szCs w:val="18"/>
+        </w:rPr>
+        <w:t xml:space="preserve"> landscape</w:t>
+      </w:r>
+      <w:r>
+        <w:rPr>
+          <w:sz w:val="18"/>
+          <w:szCs w:val="18"/>
+        </w:rPr>
+        <w:t xml:space="preserve"> </w:t>
+      </w:r>
+      <w:r>
+        <w:rPr>
+          <w:sz w:val="18"/>
+          <w:szCs w:val="18"/>
+        </w:rPr>
+        <w:t>and</w:t>
+      </w:r>
+      <w:r>
+        <w:rPr>
+          <w:sz w:val="18"/>
+          <w:szCs w:val="18"/>
+        </w:rPr>
+        <w:t xml:space="preserve"> 32 business process domains spanning security, compliance, operations, finance, and strategy</w:t>
+      </w:r>
+    </w:p>
+    <w:p>
+      <w:pPr>
+        <w:pStyle w:val="ResumeBullet"/>
+        <w:numPr>
+          <w:ilvl w:val="0"/>
+          <w:numId w:val="1"/>
+        </w:numPr>
+        <w:pBdr>
+          <w:left w:val="single" w:sz="6" w:space="11" w:color="E4E0D8"/>
+        </w:pBdr>
+        <w:spacing w:after="80" w:line="240" w:lineRule="exact"/>
+        <w:ind w:left="504" w:right="1440"/>
+        <w:rPr>
+          <w:sz w:val="18"/>
+          <w:szCs w:val="18"/>
+        </w:rPr>
+      </w:pPr>
+      <w:r>
+        <w:rPr>
+          <w:sz w:val="18"/>
+          <w:szCs w:val="18"/>
+        </w:rPr>
         <w:t>Rebooted Enterprise Architecture platform practice to use Enterprise Knowledge Graph</w:t>
       </w:r>
     </w:p>
@@ -596,11 +748,33 @@
         <w:pBdr>
           <w:left w:val="single" w:sz="6" w:space="11" w:color="E4E0D8"/>
         </w:pBdr>
-        <w:spacing w:after="0"/>
+        <w:spacing w:after="80" w:line="240" w:lineRule="exact"/>
         <w:ind w:left="504" w:right="1440"/>
+        <w:rPr>
+          <w:sz w:val="18"/>
+          <w:szCs w:val="18"/>
+        </w:rPr>
       </w:pPr>
       <w:r>
-        <w:t>Led the definition of enterprise landscape &amp; product model for 9,000+ enterprise applications</w:t>
+        <w:rPr>
+          <w:sz w:val="18"/>
+          <w:szCs w:val="18"/>
+        </w:rPr>
+        <w:t xml:space="preserve">Led the definition of enterprise landscape </w:t>
+      </w:r>
+      <w:r>
+        <w:rPr>
+          <w:sz w:val="18"/>
+          <w:szCs w:val="18"/>
+        </w:rPr>
+        <w:t>and</w:t>
+      </w:r>
+      <w:r>
+        <w:rPr>
+          <w:sz w:val="18"/>
+          <w:szCs w:val="18"/>
+        </w:rPr>
+        <w:t xml:space="preserve"> product model for 9,000+ enterprise applications</w:t>
       </w:r>
     </w:p>
     <w:p>
@@ -613,11 +787,33 @@
         <w:pBdr>
           <w:left w:val="single" w:sz="6" w:space="11" w:color="E4E0D8"/>
         </w:pBdr>
-        <w:spacing w:after="0"/>
+        <w:spacing w:after="80" w:line="240" w:lineRule="exact"/>
         <w:ind w:left="504" w:right="1440"/>
+        <w:rPr>
+          <w:sz w:val="18"/>
+          <w:szCs w:val="18"/>
+        </w:rPr>
       </w:pPr>
       <w:r>
-        <w:t>Launched and operationalized product audit practice for Tier 1 &amp; Tier 2 business-critical applications</w:t>
+        <w:rPr>
+          <w:sz w:val="18"/>
+          <w:szCs w:val="18"/>
+        </w:rPr>
+        <w:t xml:space="preserve">Launched and operationalized product audit practice for Tier 1 </w:t>
+      </w:r>
+      <w:r>
+        <w:rPr>
+          <w:sz w:val="18"/>
+          <w:szCs w:val="18"/>
+        </w:rPr>
+        <w:t>and</w:t>
+      </w:r>
+      <w:r>
+        <w:rPr>
+          <w:sz w:val="18"/>
+          <w:szCs w:val="18"/>
+        </w:rPr>
+        <w:t xml:space="preserve"> Tier 2 business-critical applications</w:t>
       </w:r>
     </w:p>
     <w:p>
@@ -630,10 +826,18 @@
         <w:pBdr>
           <w:left w:val="single" w:sz="6" w:space="11" w:color="E4E0D8"/>
         </w:pBdr>
-        <w:spacing w:after="0"/>
+        <w:spacing w:after="80" w:line="240" w:lineRule="exact"/>
         <w:ind w:left="504" w:right="1440"/>
+        <w:rPr>
+          <w:sz w:val="18"/>
+          <w:szCs w:val="18"/>
+        </w:rPr>
       </w:pPr>
       <w:r>
+        <w:rPr>
+          <w:sz w:val="18"/>
+          <w:szCs w:val="18"/>
+        </w:rPr>
         <w:t>Launched Enterprise Knowledge Management capability using federation strategy</w:t>
       </w:r>
     </w:p>
@@ -647,10 +851,18 @@
         <w:pBdr>
           <w:left w:val="single" w:sz="6" w:space="11" w:color="E4E0D8"/>
         </w:pBdr>
-        <w:spacing w:after="0"/>
+        <w:spacing w:after="80" w:line="240" w:lineRule="exact"/>
         <w:ind w:left="504" w:right="1440"/>
+        <w:rPr>
+          <w:sz w:val="18"/>
+          <w:szCs w:val="18"/>
+        </w:rPr>
       </w:pPr>
       <w:r>
+        <w:rPr>
+          <w:sz w:val="18"/>
+          <w:szCs w:val="18"/>
+        </w:rPr>
         <w:t>Filed five patent applications spanning AI, knowledge graphs, and semantic systems</w:t>
       </w:r>
     </w:p>
@@ -688,7 +900,17 @@
     <w:p>
       <w:pPr>
         <w:pStyle w:val="Heading3"/>
-        <w:spacing w:after="84" w:line="250" w:lineRule="exact"/>
+        <w:pBdr>
+          <w:left w:val="single" w:sz="6" w:space="11" w:color="E4E0D8"/>
+        </w:pBdr>
+        <w:tabs>
+          <w:tab w:val="right" w:pos="10454"/>
+        </w:tabs>
+        <w:spacing w:before="144" w:after="84" w:line="250" w:lineRule="exact"/>
+        <w:ind w:left="288"/>
+        <w:rPr>
+          <w:rFonts w:ascii="IBM Plex Sans" w:eastAsia="IBM Plex Sans" w:hAnsi="IBM Plex Sans" w:cs="IBM Plex Sans"/>
+        </w:rPr>
       </w:pPr>
       <w:r>
         <w:rPr>
@@ -704,9 +926,21 @@
           <w:ilvl w:val="0"/>
           <w:numId w:val="1"/>
         </w:numPr>
-        <w:ind w:left="216" w:right="1440"/>
+        <w:pBdr>
+          <w:left w:val="single" w:sz="6" w:space="11" w:color="E4E0D8"/>
+        </w:pBdr>
+        <w:spacing w:after="80" w:line="240" w:lineRule="exact"/>
+        <w:ind w:left="504" w:right="1440"/>
+        <w:rPr>
+          <w:sz w:val="18"/>
+          <w:szCs w:val="18"/>
+        </w:rPr>
       </w:pPr>
       <w:r>
+        <w:rPr>
+          <w:sz w:val="18"/>
+          <w:szCs w:val="18"/>
+        </w:rPr>
         <w:t>Proposed, formed, and led the Advanced Technologies Group</w:t>
       </w:r>
     </w:p>
@@ -717,9 +951,21 @@
           <w:ilvl w:val="0"/>
           <w:numId w:val="1"/>
         </w:numPr>
-        <w:ind w:left="216" w:right="1440"/>
+        <w:pBdr>
+          <w:left w:val="single" w:sz="6" w:space="11" w:color="E4E0D8"/>
+        </w:pBdr>
+        <w:spacing w:after="80" w:line="240" w:lineRule="exact"/>
+        <w:ind w:left="504" w:right="1440"/>
+        <w:rPr>
+          <w:sz w:val="18"/>
+          <w:szCs w:val="18"/>
+        </w:rPr>
       </w:pPr>
       <w:r>
+        <w:rPr>
+          <w:sz w:val="18"/>
+          <w:szCs w:val="18"/>
+        </w:rPr>
         <w:t>Formulated and implemented Blockchain Platform strategy for Web3 enterprise services</w:t>
       </w:r>
     </w:p>
@@ -730,9 +976,21 @@
           <w:ilvl w:val="0"/>
           <w:numId w:val="1"/>
         </w:numPr>
-        <w:ind w:left="216" w:right="1440"/>
+        <w:pBdr>
+          <w:left w:val="single" w:sz="6" w:space="11" w:color="E4E0D8"/>
+        </w:pBdr>
+        <w:spacing w:after="80" w:line="240" w:lineRule="exact"/>
+        <w:ind w:left="504" w:right="1440"/>
+        <w:rPr>
+          <w:sz w:val="18"/>
+          <w:szCs w:val="18"/>
+        </w:rPr>
       </w:pPr>
       <w:r>
+        <w:rPr>
+          <w:sz w:val="18"/>
+          <w:szCs w:val="18"/>
+        </w:rPr>
         <w:t>Delivered two products on the blockchain platform from conception to production in a year, securing the first commercial account and multimillion-dollar revenue projection</w:t>
       </w:r>
     </w:p>
@@ -743,10 +1001,22 @@
           <w:ilvl w:val="0"/>
           <w:numId w:val="1"/>
         </w:numPr>
-        <w:ind w:left="216" w:right="1440"/>
+        <w:pBdr>
+          <w:left w:val="single" w:sz="6" w:space="11" w:color="E4E0D8"/>
+        </w:pBdr>
+        <w:spacing w:after="80" w:line="240" w:lineRule="exact"/>
+        <w:ind w:left="504" w:right="1440"/>
+        <w:rPr>
+          <w:sz w:val="18"/>
+          <w:szCs w:val="18"/>
+        </w:rPr>
       </w:pPr>
       <w:r>
-        <w:t>Developed platform services with TypeScript, MongoDB, SQL, Kubernetes, and cloud PaaS capabilities</w:t>
+        <w:rPr>
+          <w:sz w:val="18"/>
+          <w:szCs w:val="18"/>
+        </w:rPr>
+        <w:t>Developed platform services with TypeScript, MongoDB, SQL, Kubernetes, and PaaS capabilities</w:t>
       </w:r>
     </w:p>
     <w:p>
@@ -756,22 +1026,27 @@
           <w:ilvl w:val="0"/>
           <w:numId w:val="1"/>
         </w:numPr>
-        <w:ind w:left="216" w:right="1440"/>
+        <w:pBdr>
+          <w:left w:val="single" w:sz="6" w:space="11" w:color="E4E0D8"/>
+        </w:pBdr>
+        <w:spacing w:after="80" w:line="240" w:lineRule="exact"/>
+        <w:ind w:left="504" w:right="1440"/>
+        <w:rPr>
+          <w:sz w:val="18"/>
+          <w:szCs w:val="18"/>
+        </w:rPr>
       </w:pPr>
       <w:r>
+        <w:rPr>
+          <w:sz w:val="18"/>
+          <w:szCs w:val="18"/>
+        </w:rPr>
         <w:t>Launched the Enterprise Architecture practice</w:t>
       </w:r>
     </w:p>
     <w:p>
       <w:pPr>
         <w:pStyle w:val="Heading2"/>
-        <w:pBdr>
-          <w:top w:val="single" w:sz="6" w:space="13" w:color="ECE8E1"/>
-        </w:pBdr>
-        <w:tabs>
-          <w:tab w:val="right" w:pos="10454"/>
-        </w:tabs>
-        <w:spacing w:before="250" w:after="124" w:line="320" w:lineRule="exact"/>
       </w:pPr>
       <w:r>
         <w:rPr>
@@ -797,7 +1072,17 @@
     <w:p>
       <w:pPr>
         <w:pStyle w:val="Heading3"/>
-        <w:spacing w:after="84" w:line="250" w:lineRule="exact"/>
+        <w:pBdr>
+          <w:left w:val="single" w:sz="6" w:space="11" w:color="E4E0D8"/>
+        </w:pBdr>
+        <w:tabs>
+          <w:tab w:val="right" w:pos="10454"/>
+        </w:tabs>
+        <w:spacing w:before="144" w:after="84" w:line="250" w:lineRule="exact"/>
+        <w:ind w:left="288"/>
+        <w:rPr>
+          <w:rFonts w:ascii="IBM Plex Sans" w:eastAsia="IBM Plex Sans" w:hAnsi="IBM Plex Sans" w:cs="IBM Plex Sans"/>
+        </w:rPr>
       </w:pPr>
       <w:r>
         <w:rPr>
@@ -813,9 +1098,21 @@
           <w:ilvl w:val="0"/>
           <w:numId w:val="1"/>
         </w:numPr>
-        <w:ind w:left="216" w:right="1440"/>
+        <w:pBdr>
+          <w:left w:val="single" w:sz="6" w:space="11" w:color="E4E0D8"/>
+        </w:pBdr>
+        <w:spacing w:after="80" w:line="240" w:lineRule="exact"/>
+        <w:ind w:left="504" w:right="1440"/>
+        <w:rPr>
+          <w:sz w:val="18"/>
+          <w:szCs w:val="18"/>
+        </w:rPr>
       </w:pPr>
       <w:r>
+        <w:rPr>
+          <w:sz w:val="18"/>
+          <w:szCs w:val="18"/>
+        </w:rPr>
         <w:t>Architected and developed EcoStruxure 2.0, increasing uptime from 99% to 99.99%</w:t>
       </w:r>
     </w:p>
@@ -826,9 +1123,21 @@
           <w:ilvl w:val="0"/>
           <w:numId w:val="1"/>
         </w:numPr>
-        <w:ind w:left="216" w:right="1440"/>
+        <w:pBdr>
+          <w:left w:val="single" w:sz="6" w:space="11" w:color="E4E0D8"/>
+        </w:pBdr>
+        <w:spacing w:after="80" w:line="240" w:lineRule="exact"/>
+        <w:ind w:left="504" w:right="1440"/>
+        <w:rPr>
+          <w:sz w:val="18"/>
+          <w:szCs w:val="18"/>
+        </w:rPr>
       </w:pPr>
       <w:r>
+        <w:rPr>
+          <w:sz w:val="18"/>
+          <w:szCs w:val="18"/>
+        </w:rPr>
         <w:t>Developed and socialized capability-centric IoT reference architecture for the Microsoft Azure-based IoT platform (EcoStruxure)</w:t>
       </w:r>
     </w:p>
@@ -839,9 +1148,21 @@
           <w:ilvl w:val="0"/>
           <w:numId w:val="1"/>
         </w:numPr>
-        <w:ind w:left="216" w:right="1440"/>
+        <w:pBdr>
+          <w:left w:val="single" w:sz="6" w:space="11" w:color="E4E0D8"/>
+        </w:pBdr>
+        <w:spacing w:after="80" w:line="240" w:lineRule="exact"/>
+        <w:ind w:left="504" w:right="1440"/>
+        <w:rPr>
+          <w:sz w:val="18"/>
+          <w:szCs w:val="18"/>
+        </w:rPr>
       </w:pPr>
       <w:r>
+        <w:rPr>
+          <w:sz w:val="18"/>
+          <w:szCs w:val="18"/>
+        </w:rPr>
         <w:t>Designed and developed EcoStruxure platform components and services (LPWAN integration, Ontology service, etc.) using C#, .NET, Azure Data Lake, and MongoDB</w:t>
       </w:r>
     </w:p>
@@ -852,9 +1173,21 @@
           <w:ilvl w:val="0"/>
           <w:numId w:val="1"/>
         </w:numPr>
-        <w:ind w:left="216" w:right="1440"/>
+        <w:pBdr>
+          <w:left w:val="single" w:sz="6" w:space="11" w:color="E4E0D8"/>
+        </w:pBdr>
+        <w:spacing w:after="80" w:line="240" w:lineRule="exact"/>
+        <w:ind w:left="504" w:right="1440"/>
+        <w:rPr>
+          <w:sz w:val="18"/>
+          <w:szCs w:val="18"/>
+        </w:rPr>
       </w:pPr>
       <w:r>
+        <w:rPr>
+          <w:sz w:val="18"/>
+          <w:szCs w:val="18"/>
+        </w:rPr>
         <w:t>Designed IoT training courses and taught them to teams around the globe</w:t>
       </w:r>
     </w:p>
@@ -865,10 +1198,38 @@
           <w:ilvl w:val="0"/>
           <w:numId w:val="1"/>
         </w:numPr>
-        <w:ind w:left="216" w:right="1440"/>
+        <w:pBdr>
+          <w:left w:val="single" w:sz="6" w:space="11" w:color="E4E0D8"/>
+        </w:pBdr>
+        <w:spacing w:after="80" w:line="240" w:lineRule="exact"/>
+        <w:ind w:left="504" w:right="1440"/>
+        <w:rPr>
+          <w:sz w:val="18"/>
+          <w:szCs w:val="18"/>
+        </w:rPr>
       </w:pPr>
       <w:r>
-        <w:t>Led multiple projects across IoT and IIoT domains, including Industry 4.0 and Green energy projects</w:t>
+        <w:rPr>
+          <w:sz w:val="18"/>
+          <w:szCs w:val="18"/>
+        </w:rPr>
+        <w:t xml:space="preserve">Led multiple projects across IoT and IIoT domains, including Industry 4.0 and </w:t>
+      </w:r>
+      <w:proofErr w:type="gramStart"/>
+      <w:r>
+        <w:rPr>
+          <w:sz w:val="18"/>
+          <w:szCs w:val="18"/>
+        </w:rPr>
+        <w:t>Green</w:t>
+      </w:r>
+      <w:proofErr w:type="gramEnd"/>
+      <w:r>
+        <w:rPr>
+          <w:sz w:val="18"/>
+          <w:szCs w:val="18"/>
+        </w:rPr>
+        <w:t xml:space="preserve"> energy projects</w:t>
       </w:r>
     </w:p>
     <w:p>
@@ -878,9 +1239,21 @@
           <w:ilvl w:val="0"/>
           <w:numId w:val="1"/>
         </w:numPr>
-        <w:ind w:left="216" w:right="1440"/>
+        <w:pBdr>
+          <w:left w:val="single" w:sz="6" w:space="11" w:color="E4E0D8"/>
+        </w:pBdr>
+        <w:spacing w:after="80" w:line="240" w:lineRule="exact"/>
+        <w:ind w:left="504" w:right="1440"/>
+        <w:rPr>
+          <w:sz w:val="18"/>
+          <w:szCs w:val="18"/>
+        </w:rPr>
       </w:pPr>
       <w:r>
+        <w:rPr>
+          <w:sz w:val="18"/>
+          <w:szCs w:val="18"/>
+        </w:rPr>
         <w:t>Initiated multiple internal projects across Enterprise Architecture and knowledge domains</w:t>
       </w:r>
     </w:p>
@@ -918,7 +1291,17 @@
     <w:p>
       <w:pPr>
         <w:pStyle w:val="Heading3"/>
-        <w:spacing w:after="84" w:line="250" w:lineRule="exact"/>
+        <w:pBdr>
+          <w:left w:val="single" w:sz="6" w:space="11" w:color="E4E0D8"/>
+        </w:pBdr>
+        <w:tabs>
+          <w:tab w:val="right" w:pos="10454"/>
+        </w:tabs>
+        <w:spacing w:before="144" w:after="84" w:line="250" w:lineRule="exact"/>
+        <w:ind w:left="288"/>
+        <w:rPr>
+          <w:rFonts w:ascii="IBM Plex Sans" w:eastAsia="IBM Plex Sans" w:hAnsi="IBM Plex Sans" w:cs="IBM Plex Sans"/>
+        </w:rPr>
       </w:pPr>
       <w:r>
         <w:rPr>
@@ -934,9 +1317,21 @@
           <w:ilvl w:val="0"/>
           <w:numId w:val="1"/>
         </w:numPr>
-        <w:ind w:left="216" w:right="1440"/>
+        <w:pBdr>
+          <w:left w:val="single" w:sz="6" w:space="11" w:color="E4E0D8"/>
+        </w:pBdr>
+        <w:spacing w:after="80" w:line="240" w:lineRule="exact"/>
+        <w:ind w:left="504" w:right="1440"/>
+        <w:rPr>
+          <w:sz w:val="18"/>
+          <w:szCs w:val="18"/>
+        </w:rPr>
       </w:pPr>
       <w:r>
+        <w:rPr>
+          <w:sz w:val="18"/>
+          <w:szCs w:val="18"/>
+        </w:rPr>
         <w:t>Managed a best-in-class knowledge base on the MediaWiki platform, with 200,000+ articles</w:t>
       </w:r>
     </w:p>
@@ -947,9 +1342,21 @@
           <w:ilvl w:val="0"/>
           <w:numId w:val="1"/>
         </w:numPr>
-        <w:ind w:left="216" w:right="1440"/>
+        <w:pBdr>
+          <w:left w:val="single" w:sz="6" w:space="11" w:color="E4E0D8"/>
+        </w:pBdr>
+        <w:spacing w:after="80" w:line="240" w:lineRule="exact"/>
+        <w:ind w:left="504" w:right="1440"/>
+        <w:rPr>
+          <w:sz w:val="18"/>
+          <w:szCs w:val="18"/>
+        </w:rPr>
       </w:pPr>
       <w:r>
+        <w:rPr>
+          <w:sz w:val="18"/>
+          <w:szCs w:val="18"/>
+        </w:rPr>
         <w:t>Designed and led the implementation of high-availability architecture for the company MediaWiki cluster, achieving 50% latency reduction and uptime improvement from 98% to 99.995%</w:t>
       </w:r>
     </w:p>
@@ -960,9 +1367,21 @@
           <w:ilvl w:val="0"/>
           <w:numId w:val="1"/>
         </w:numPr>
-        <w:ind w:left="216" w:right="1440"/>
+        <w:pBdr>
+          <w:left w:val="single" w:sz="6" w:space="11" w:color="E4E0D8"/>
+        </w:pBdr>
+        <w:spacing w:after="80" w:line="240" w:lineRule="exact"/>
+        <w:ind w:left="504" w:right="1440"/>
+        <w:rPr>
+          <w:sz w:val="18"/>
+          <w:szCs w:val="18"/>
+        </w:rPr>
       </w:pPr>
       <w:r>
+        <w:rPr>
+          <w:sz w:val="18"/>
+          <w:szCs w:val="18"/>
+        </w:rPr>
         <w:t>Initiated and led through completion the migration of the LKM group’s systems to a DevOps platform (Puppet), achieving 75% reduction in operating cost</w:t>
       </w:r>
     </w:p>
@@ -973,9 +1392,21 @@
           <w:ilvl w:val="0"/>
           <w:numId w:val="1"/>
         </w:numPr>
-        <w:ind w:left="216" w:right="1440"/>
+        <w:pBdr>
+          <w:left w:val="single" w:sz="6" w:space="11" w:color="E4E0D8"/>
+        </w:pBdr>
+        <w:spacing w:after="80" w:line="240" w:lineRule="exact"/>
+        <w:ind w:left="504" w:right="1440"/>
+        <w:rPr>
+          <w:sz w:val="18"/>
+          <w:szCs w:val="18"/>
+        </w:rPr>
       </w:pPr>
       <w:r>
+        <w:rPr>
+          <w:sz w:val="18"/>
+          <w:szCs w:val="18"/>
+        </w:rPr>
         <w:t>Architected corporate document storage, enabling discoverability of 6 million documents</w:t>
       </w:r>
     </w:p>
@@ -986,23 +1417,22 @@
           <w:ilvl w:val="0"/>
           <w:numId w:val="1"/>
         </w:numPr>
-        <w:ind w:left="216" w:right="1440"/>
+        <w:pBdr>
+          <w:left w:val="single" w:sz="6" w:space="11" w:color="E4E0D8"/>
+        </w:pBdr>
+        <w:spacing w:after="80" w:line="240" w:lineRule="exact"/>
+        <w:ind w:left="504" w:right="1440"/>
+        <w:rPr>
+          <w:sz w:val="18"/>
+          <w:szCs w:val="18"/>
+        </w:rPr>
       </w:pPr>
       <w:r>
+        <w:rPr>
+          <w:sz w:val="18"/>
+          <w:szCs w:val="18"/>
+        </w:rPr>
         <w:t>Initiated and led the implementation of the group REST microservice platform</w:t>
-      </w:r>
-    </w:p>
-    <w:p>
-      <w:pPr>
-        <w:pStyle w:val="ResumeBullet"/>
-        <w:numPr>
-          <w:ilvl w:val="0"/>
-          <w:numId w:val="1"/>
-        </w:numPr>
-        <w:ind w:left="216" w:right="1440"/>
-      </w:pPr>
-      <w:r>
-        <w:t>Mentored junior developers in software engineering and architecture processes and methodologies</w:t>
       </w:r>
     </w:p>
     <w:p>
@@ -1016,11 +1446,19 @@
         </w:tabs>
         <w:spacing w:before="250" w:after="124" w:line="320" w:lineRule="exact"/>
       </w:pPr>
+      <w:proofErr w:type="spellStart"/>
       <w:r>
         <w:rPr>
           <w:rFonts w:ascii="Spectral" w:eastAsia="Spectral" w:hAnsi="Spectral" w:cs="Spectral"/>
         </w:rPr>
-        <w:t>AskOnline Inc.</w:t>
+        <w:t>AskOnline</w:t>
+      </w:r>
+      <w:proofErr w:type="spellEnd"/>
+      <w:r>
+        <w:rPr>
+          <w:rFonts w:ascii="Spectral" w:eastAsia="Spectral" w:hAnsi="Spectral" w:cs="Spectral"/>
+        </w:rPr>
+        <w:t xml:space="preserve"> Inc.</w:t>
       </w:r>
       <w:r>
         <w:tab/>
@@ -1077,11 +1515,61 @@
         <w:pBdr>
           <w:left w:val="single" w:sz="6" w:space="11" w:color="E4E0D8"/>
         </w:pBdr>
-        <w:spacing w:after="0"/>
+        <w:spacing w:after="80" w:line="240" w:lineRule="exact"/>
         <w:ind w:left="504" w:right="1440"/>
+        <w:rPr>
+          <w:sz w:val="18"/>
+          <w:szCs w:val="18"/>
+        </w:rPr>
       </w:pPr>
       <w:r>
-        <w:t>Led development effort for a Software-as-a-Service solution that scaled to over 300,000 users, achieving 99.99% service uptime</w:t>
+        <w:rPr>
+          <w:sz w:val="18"/>
+          <w:szCs w:val="18"/>
+        </w:rPr>
+        <w:t xml:space="preserve">Led development effort for a </w:t>
+      </w:r>
+      <w:r>
+        <w:rPr>
+          <w:sz w:val="18"/>
+          <w:szCs w:val="18"/>
+        </w:rPr>
+        <w:t>SaaS</w:t>
+      </w:r>
+      <w:r>
+        <w:rPr>
+          <w:sz w:val="18"/>
+          <w:szCs w:val="18"/>
+        </w:rPr>
+        <w:t xml:space="preserve"> solution that scaled to 300,000</w:t>
+      </w:r>
+      <w:r>
+        <w:rPr>
+          <w:sz w:val="18"/>
+          <w:szCs w:val="18"/>
+        </w:rPr>
+        <w:t>+</w:t>
+      </w:r>
+      <w:r>
+        <w:rPr>
+          <w:sz w:val="18"/>
+          <w:szCs w:val="18"/>
+        </w:rPr>
+        <w:t xml:space="preserve"> users</w:t>
+      </w:r>
+      <w:r>
+        <w:rPr>
+          <w:sz w:val="18"/>
+          <w:szCs w:val="18"/>
+        </w:rPr>
+        <w:t xml:space="preserve"> with </w:t>
+      </w:r>
+      <w:r>
+        <w:rPr>
+          <w:sz w:val="18"/>
+          <w:szCs w:val="18"/>
+        </w:rPr>
+        <w:t>99.99% service uptime</w:t>
       </w:r>
     </w:p>
     <w:p>
@@ -1094,16 +1582,32 @@
         <w:pBdr>
           <w:left w:val="single" w:sz="6" w:space="11" w:color="E4E0D8"/>
         </w:pBdr>
-        <w:spacing w:after="0"/>
+        <w:spacing w:after="80" w:line="240" w:lineRule="exact"/>
         <w:ind w:left="504" w:right="1440"/>
+        <w:rPr>
+          <w:sz w:val="18"/>
+          <w:szCs w:val="18"/>
+        </w:rPr>
       </w:pPr>
       <w:r>
+        <w:rPr>
+          <w:sz w:val="18"/>
+          <w:szCs w:val="18"/>
+        </w:rPr>
         <w:t>Oversaw platform integration with the clients’ IT infrastructure (A</w:t>
       </w:r>
       <w:r>
+        <w:rPr>
+          <w:sz w:val="18"/>
+          <w:szCs w:val="18"/>
+        </w:rPr>
         <w:t>D</w:t>
       </w:r>
       <w:r>
+        <w:rPr>
+          <w:sz w:val="18"/>
+          <w:szCs w:val="18"/>
+        </w:rPr>
         <w:t>DS, LDAP, SSO, etc.)</w:t>
       </w:r>
     </w:p>
@@ -1117,10 +1621,18 @@
         <w:pBdr>
           <w:left w:val="single" w:sz="6" w:space="11" w:color="E4E0D8"/>
         </w:pBdr>
-        <w:spacing w:after="0"/>
+        <w:spacing w:after="80" w:line="240" w:lineRule="exact"/>
         <w:ind w:left="504" w:right="1440"/>
+        <w:rPr>
+          <w:sz w:val="18"/>
+          <w:szCs w:val="18"/>
+        </w:rPr>
       </w:pPr>
       <w:r>
+        <w:rPr>
+          <w:sz w:val="18"/>
+          <w:szCs w:val="18"/>
+        </w:rPr>
         <w:t>Deployed the sales support infrastructure, integrating it with third-party analytics services</w:t>
       </w:r>
     </w:p>
@@ -1134,10 +1646,18 @@
         <w:pBdr>
           <w:left w:val="single" w:sz="6" w:space="11" w:color="E4E0D8"/>
         </w:pBdr>
-        <w:spacing w:after="0"/>
+        <w:spacing w:after="80" w:line="240" w:lineRule="exact"/>
         <w:ind w:left="504" w:right="1440"/>
+        <w:rPr>
+          <w:sz w:val="18"/>
+          <w:szCs w:val="18"/>
+        </w:rPr>
       </w:pPr>
       <w:r>
+        <w:rPr>
+          <w:sz w:val="18"/>
+          <w:szCs w:val="18"/>
+        </w:rPr>
         <w:t>Led customer support and success management for 200+ clients</w:t>
       </w:r>
     </w:p>
@@ -1182,10 +1702,18 @@
         <w:pBdr>
           <w:left w:val="single" w:sz="6" w:space="11" w:color="E4E0D8"/>
         </w:pBdr>
-        <w:spacing w:after="0"/>
+        <w:spacing w:after="80" w:line="240" w:lineRule="exact"/>
         <w:ind w:left="504" w:right="1440"/>
+        <w:rPr>
+          <w:sz w:val="18"/>
+          <w:szCs w:val="18"/>
+        </w:rPr>
       </w:pPr>
       <w:r>
+        <w:rPr>
+          <w:sz w:val="18"/>
+          <w:szCs w:val="18"/>
+        </w:rPr>
         <w:t>Developed the SaaS application in the LAMP stack</w:t>
       </w:r>
     </w:p>
@@ -1199,10 +1727,18 @@
         <w:pBdr>
           <w:left w:val="single" w:sz="6" w:space="11" w:color="E4E0D8"/>
         </w:pBdr>
-        <w:spacing w:after="0"/>
+        <w:spacing w:after="80" w:line="240" w:lineRule="exact"/>
         <w:ind w:left="504" w:right="1440"/>
+        <w:rPr>
+          <w:sz w:val="18"/>
+          <w:szCs w:val="18"/>
+        </w:rPr>
       </w:pPr>
       <w:r>
+        <w:rPr>
+          <w:sz w:val="18"/>
+          <w:szCs w:val="18"/>
+        </w:rPr>
         <w:t>Integrated with the clients’ IT infrastructure (ADDS, LDAP, SSO, etc.)</w:t>
       </w:r>
     </w:p>
@@ -1216,10 +1752,18 @@
         <w:pBdr>
           <w:left w:val="single" w:sz="6" w:space="11" w:color="E4E0D8"/>
         </w:pBdr>
-        <w:spacing w:after="0"/>
+        <w:spacing w:after="80" w:line="240" w:lineRule="exact"/>
         <w:ind w:left="504" w:right="1440"/>
+        <w:rPr>
+          <w:sz w:val="18"/>
+          <w:szCs w:val="18"/>
+        </w:rPr>
       </w:pPr>
       <w:r>
+        <w:rPr>
+          <w:sz w:val="18"/>
+          <w:szCs w:val="18"/>
+        </w:rPr>
         <w:t>Administered the server backend for the SaaS deployment</w:t>
       </w:r>
     </w:p>
@@ -1241,19 +1785,18 @@
       </w:r>
       <w:r>
         <w:rPr>
-          <w:rFonts w:ascii="IBM Plex Sans" w:hAnsi="IBM Plex Sans" w:eastAsia="IBM Plex Sans" w:cs="IBM Plex Sans"/>
-          <w:sz w:val="17"/>
+          <w:rFonts w:ascii="IBM Plex Sans" w:eastAsia="IBM Plex Sans" w:hAnsi="IBM Plex Sans" w:cs="IBM Plex Sans"/>
         </w:rPr>
         <w:tab/>
       </w:r>
       <w:r>
         <w:rPr>
           <w:color w:val="DDD8D0"/>
+          <w:position w:val="5"/>
           <w:sz w:val="18"/>
-          <w:position w:val="5"/>
         </w:rPr>
         <w:tab/>
-        <w:t xml:space="preserve"> </w:t>
+        <w:t> </w:t>
       </w:r>
     </w:p>
     <w:tbl>
@@ -1272,8 +1815,7 @@
       </w:tblPr>
       <w:tblGrid>
         <w:gridCol w:w="5227"/>
-        <w:gridCol w:w="473"/>
-        <w:gridCol w:w="4754"/>
+        <w:gridCol w:w="5227"/>
       </w:tblGrid>
       <w:tr>
         <w:trPr>
@@ -1321,7 +1863,6 @@
         <w:tc>
           <w:tcPr>
             <w:tcW w:w="5227" w:type="dxa"/>
-            <w:gridSpan w:val="2"/>
             <w:tcMar>
               <w:top w:w="0" w:type="dxa"/>
               <w:left w:w="190" w:type="dxa"/>
@@ -1405,7 +1946,6 @@
         <w:tc>
           <w:tcPr>
             <w:tcW w:w="5227" w:type="dxa"/>
-            <w:gridSpan w:val="2"/>
             <w:tcMar>
               <w:top w:w="120" w:type="dxa"/>
               <w:left w:w="190" w:type="dxa"/>
@@ -1432,25 +1972,318 @@
             <w:pPr>
               <w:keepLines/>
               <w:spacing w:line="252" w:lineRule="exact"/>
+              <w:rPr>
+                <w:color w:val="6B655D"/>
+                <w:sz w:val="18"/>
+              </w:rPr>
             </w:pPr>
             <w:r>
               <w:rPr>
                 <w:color w:val="6B655D"/>
                 <w:sz w:val="18"/>
               </w:rPr>
-              <w:t>TOGAF 9</w:t>
-            </w:r>
-            <w:r>
-              <w:rPr>
-                <w:color w:val="6B655D"/>
-                <w:sz w:val="18"/>
-              </w:rPr>
-              <w:t xml:space="preserve"> Certified</w:t>
+              <w:t>TOGAF 9 Certified</w:t>
             </w:r>
           </w:p>
         </w:tc>
       </w:tr>
     </w:tbl>
+    <w:p>
+      <w:pPr>
+        <w:pStyle w:val="Heading1"/>
+        <w:tabs>
+          <w:tab w:val="left" w:pos="5700"/>
+          <w:tab w:val="right" w:leader="underscore" w:pos="10454"/>
+        </w:tabs>
+        <w:spacing w:before="360" w:after="140" w:line="210" w:lineRule="exact"/>
+        <w:rPr>
+          <w:rFonts w:ascii="IBM Plex Sans" w:eastAsia="IBM Plex Sans" w:hAnsi="IBM Plex Sans" w:cs="IBM Plex Sans"/>
+          <w:spacing w:val="31"/>
+        </w:rPr>
+      </w:pPr>
+      <w:r>
+        <w:rPr>
+          <w:rFonts w:ascii="IBM Plex Sans" w:eastAsia="IBM Plex Sans" w:hAnsi="IBM Plex Sans" w:cs="IBM Plex Sans"/>
+          <w:spacing w:val="31"/>
+        </w:rPr>
+        <w:t>INTELLECTUAL PROPERTY &amp; STANDARDS SUMMARY</w:t>
+      </w:r>
+      <w:r>
+        <w:rPr>
+          <w:rFonts w:ascii="IBM Plex Sans" w:eastAsia="IBM Plex Sans" w:hAnsi="IBM Plex Sans" w:cs="IBM Plex Sans"/>
+        </w:rPr>
+        <w:tab/>
+      </w:r>
+      <w:r>
+        <w:rPr>
+          <w:color w:val="DDD8D0"/>
+          <w:position w:val="5"/>
+          <w:sz w:val="18"/>
+        </w:rPr>
+        <w:tab/>
+      </w:r>
+    </w:p>
+    <w:tbl>
+      <w:tblPr>
+        <w:tblW w:w="10712" w:type="dxa"/>
+        <w:tblBorders>
+          <w:top w:val="single" w:sz="4" w:space="0" w:color="auto"/>
+          <w:left w:val="single" w:sz="4" w:space="0" w:color="auto"/>
+          <w:bottom w:val="single" w:sz="4" w:space="0" w:color="auto"/>
+          <w:right w:val="single" w:sz="4" w:space="0" w:color="auto"/>
+        </w:tblBorders>
+        <w:tblLayout w:type="fixed"/>
+        <w:tblLook w:val="04A0" w:firstRow="1" w:lastRow="0" w:firstColumn="1" w:lastColumn="0" w:noHBand="0" w:noVBand="1"/>
+      </w:tblPr>
+      <w:tblGrid>
+        <w:gridCol w:w="422"/>
+        <w:gridCol w:w="2205"/>
+        <w:gridCol w:w="724"/>
+        <w:gridCol w:w="2105"/>
+        <w:gridCol w:w="338"/>
+        <w:gridCol w:w="2289"/>
+        <w:gridCol w:w="425"/>
+        <w:gridCol w:w="2204"/>
+      </w:tblGrid>
+      <w:tr>
+        <w:trPr>
+          <w:cantSplit/>
+        </w:trPr>
+        <w:tc>
+          <w:tcPr>
+            <w:tcW w:w="420" w:type="dxa"/>
+            <w:tcBorders>
+              <w:top w:val="single" w:sz="4" w:space="0" w:color="auto"/>
+              <w:bottom w:val="single" w:sz="4" w:space="0" w:color="auto"/>
+            </w:tcBorders>
+            <w:shd w:val="clear" w:color="auto" w:fill="FBFAF8"/>
+            <w:tcMar>
+              <w:top w:w="115" w:type="dxa"/>
+              <w:left w:w="150" w:type="dxa"/>
+              <w:bottom w:w="105" w:type="dxa"/>
+              <w:right w:w="120" w:type="dxa"/>
+            </w:tcMar>
+            <w:vAlign w:val="center"/>
+          </w:tcPr>
+          <w:p>
+            <w:pPr>
+              <w:keepNext/>
+              <w:keepLines/>
+              <w:spacing w:after="70" w:line="440" w:lineRule="exact"/>
+            </w:pPr>
+            <w:r>
+              <w:rPr>
+                <w:rFonts w:ascii="Spectral Light" w:eastAsia="Spectral Light" w:hAnsi="Spectral Light" w:cs="Spectral Light"/>
+                <w:color w:val="2C4A66"/>
+                <w:sz w:val="42"/>
+              </w:rPr>
+              <w:t>8</w:t>
+            </w:r>
+          </w:p>
+        </w:tc>
+        <w:tc>
+          <w:tcPr>
+            <w:tcW w:w="2193" w:type="dxa"/>
+            <w:tcBorders>
+              <w:top w:val="single" w:sz="4" w:space="0" w:color="auto"/>
+              <w:bottom w:val="single" w:sz="4" w:space="0" w:color="auto"/>
+              <w:right w:val="single" w:sz="4" w:space="0" w:color="auto"/>
+            </w:tcBorders>
+            <w:shd w:val="clear" w:color="auto" w:fill="FBFAF8"/>
+            <w:vAlign w:val="center"/>
+          </w:tcPr>
+          <w:p>
+            <w:pPr>
+              <w:keepLines/>
+              <w:spacing w:line="184" w:lineRule="exact"/>
+            </w:pPr>
+            <w:r>
+              <w:rPr>
+                <w:b/>
+                <w:color w:val="7A736A"/>
+                <w:spacing w:val="17"/>
+                <w:sz w:val="14"/>
+              </w:rPr>
+              <w:t>ISSUED PATENTS</w:t>
+            </w:r>
+          </w:p>
+        </w:tc>
+        <w:tc>
+          <w:tcPr>
+            <w:tcW w:w="720" w:type="dxa"/>
+            <w:tcBorders>
+              <w:top w:val="single" w:sz="4" w:space="0" w:color="auto"/>
+              <w:left w:val="single" w:sz="4" w:space="0" w:color="auto"/>
+              <w:bottom w:val="single" w:sz="4" w:space="0" w:color="auto"/>
+            </w:tcBorders>
+            <w:shd w:val="clear" w:color="auto" w:fill="FBFAF8"/>
+            <w:tcMar>
+              <w:top w:w="115" w:type="dxa"/>
+              <w:left w:w="150" w:type="dxa"/>
+              <w:bottom w:w="105" w:type="dxa"/>
+              <w:right w:w="120" w:type="dxa"/>
+            </w:tcMar>
+            <w:vAlign w:val="center"/>
+          </w:tcPr>
+          <w:p>
+            <w:pPr>
+              <w:keepNext/>
+              <w:keepLines/>
+              <w:spacing w:after="70" w:line="440" w:lineRule="exact"/>
+            </w:pPr>
+            <w:r>
+              <w:rPr>
+                <w:rFonts w:ascii="Spectral Light" w:eastAsia="Spectral Light" w:hAnsi="Spectral Light" w:cs="Spectral Light"/>
+                <w:color w:val="2C4A66"/>
+                <w:sz w:val="42"/>
+              </w:rPr>
+              <w:t>10</w:t>
+            </w:r>
+          </w:p>
+        </w:tc>
+        <w:tc>
+          <w:tcPr>
+            <w:tcW w:w="2094" w:type="dxa"/>
+            <w:tcBorders>
+              <w:top w:val="single" w:sz="4" w:space="0" w:color="auto"/>
+              <w:bottom w:val="single" w:sz="4" w:space="0" w:color="auto"/>
+              <w:right w:val="single" w:sz="4" w:space="0" w:color="auto"/>
+            </w:tcBorders>
+            <w:shd w:val="clear" w:color="auto" w:fill="FBFAF8"/>
+            <w:vAlign w:val="center"/>
+          </w:tcPr>
+          <w:p>
+            <w:pPr>
+              <w:keepLines/>
+              <w:spacing w:line="184" w:lineRule="exact"/>
+            </w:pPr>
+            <w:r>
+              <w:rPr>
+                <w:b/>
+                <w:color w:val="7A736A"/>
+                <w:spacing w:val="17"/>
+                <w:sz w:val="14"/>
+              </w:rPr>
+              <w:t>PENDING APPLICATIONS</w:t>
+            </w:r>
+          </w:p>
+        </w:tc>
+        <w:tc>
+          <w:tcPr>
+            <w:tcW w:w="336" w:type="dxa"/>
+            <w:tcBorders>
+              <w:top w:val="single" w:sz="4" w:space="0" w:color="auto"/>
+              <w:left w:val="single" w:sz="4" w:space="0" w:color="auto"/>
+              <w:bottom w:val="single" w:sz="4" w:space="0" w:color="auto"/>
+            </w:tcBorders>
+            <w:shd w:val="clear" w:color="auto" w:fill="FBFAF8"/>
+            <w:tcMar>
+              <w:top w:w="115" w:type="dxa"/>
+              <w:left w:w="150" w:type="dxa"/>
+              <w:bottom w:w="105" w:type="dxa"/>
+              <w:right w:w="120" w:type="dxa"/>
+            </w:tcMar>
+            <w:vAlign w:val="center"/>
+          </w:tcPr>
+          <w:p>
+            <w:pPr>
+              <w:keepNext/>
+              <w:keepLines/>
+              <w:spacing w:after="70" w:line="440" w:lineRule="exact"/>
+            </w:pPr>
+            <w:r>
+              <w:rPr>
+                <w:rFonts w:ascii="Spectral Light" w:eastAsia="Spectral Light" w:hAnsi="Spectral Light" w:cs="Spectral Light"/>
+                <w:color w:val="2C4A66"/>
+                <w:sz w:val="42"/>
+              </w:rPr>
+              <w:t>4</w:t>
+            </w:r>
+          </w:p>
+        </w:tc>
+        <w:tc>
+          <w:tcPr>
+            <w:tcW w:w="2277" w:type="dxa"/>
+            <w:tcBorders>
+              <w:top w:val="single" w:sz="4" w:space="0" w:color="auto"/>
+              <w:bottom w:val="single" w:sz="4" w:space="0" w:color="auto"/>
+              <w:right w:val="single" w:sz="4" w:space="0" w:color="auto"/>
+            </w:tcBorders>
+            <w:shd w:val="clear" w:color="auto" w:fill="FBFAF8"/>
+            <w:vAlign w:val="center"/>
+          </w:tcPr>
+          <w:p>
+            <w:pPr>
+              <w:keepLines/>
+              <w:spacing w:line="184" w:lineRule="exact"/>
+            </w:pPr>
+            <w:r>
+              <w:rPr>
+                <w:b/>
+                <w:color w:val="7A736A"/>
+                <w:spacing w:val="17"/>
+                <w:sz w:val="14"/>
+              </w:rPr>
+              <w:t>PUBLICATIONS</w:t>
+            </w:r>
+          </w:p>
+        </w:tc>
+        <w:tc>
+          <w:tcPr>
+            <w:tcW w:w="423" w:type="dxa"/>
+            <w:tcBorders>
+              <w:left w:val="single" w:sz="4" w:space="0" w:color="auto"/>
+            </w:tcBorders>
+            <w:shd w:val="clear" w:color="auto" w:fill="FBFAF8"/>
+            <w:tcMar>
+              <w:top w:w="115" w:type="dxa"/>
+              <w:left w:w="150" w:type="dxa"/>
+              <w:bottom w:w="105" w:type="dxa"/>
+              <w:right w:w="120" w:type="dxa"/>
+            </w:tcMar>
+            <w:vAlign w:val="center"/>
+          </w:tcPr>
+          <w:p>
+            <w:pPr>
+              <w:keepNext/>
+              <w:keepLines/>
+              <w:spacing w:after="70" w:line="440" w:lineRule="exact"/>
+            </w:pPr>
+            <w:r>
+              <w:rPr>
+                <w:rFonts w:ascii="Spectral Light" w:eastAsia="Spectral Light" w:hAnsi="Spectral Light" w:cs="Spectral Light"/>
+                <w:color w:val="2C4A66"/>
+                <w:sz w:val="42"/>
+              </w:rPr>
+              <w:t>3</w:t>
+            </w:r>
+          </w:p>
+        </w:tc>
+        <w:tc>
+          <w:tcPr>
+            <w:tcW w:w="2192" w:type="dxa"/>
+            <w:shd w:val="clear" w:color="auto" w:fill="FBFAF8"/>
+            <w:vAlign w:val="center"/>
+          </w:tcPr>
+          <w:p>
+            <w:pPr>
+              <w:keepLines/>
+              <w:spacing w:line="184" w:lineRule="exact"/>
+            </w:pPr>
+            <w:r>
+              <w:rPr>
+                <w:b/>
+                <w:color w:val="7A736A"/>
+                <w:spacing w:val="17"/>
+                <w:sz w:val="14"/>
+              </w:rPr>
+              <w:t>STANDARDS CONTRIBUTIONS</w:t>
+            </w:r>
+          </w:p>
+        </w:tc>
+      </w:tr>
+    </w:tbl>
+    <w:p/>
     <w:p>
       <w:pPr>
         <w:pageBreakBefore/>
@@ -1475,19 +2308,18 @@
       </w:r>
       <w:r>
         <w:rPr>
-          <w:rFonts w:ascii="IBM Plex Sans" w:hAnsi="IBM Plex Sans" w:eastAsia="IBM Plex Sans" w:cs="IBM Plex Sans"/>
-          <w:sz w:val="17"/>
+          <w:rFonts w:ascii="IBM Plex Sans" w:eastAsia="IBM Plex Sans" w:hAnsi="IBM Plex Sans" w:cs="IBM Plex Sans"/>
         </w:rPr>
         <w:tab/>
       </w:r>
       <w:r>
         <w:rPr>
           <w:color w:val="DDD8D0"/>
+          <w:position w:val="5"/>
           <w:sz w:val="18"/>
-          <w:position w:val="5"/>
         </w:rPr>
         <w:tab/>
-        <w:t xml:space="preserve"> </w:t>
+        <w:t> </w:t>
       </w:r>
     </w:p>
     <w:p>
@@ -1505,224 +2337,6 @@
         <w:t>Addendum to the résumé of Victor Danilchenko</w:t>
       </w:r>
     </w:p>
-    <w:tbl>
-      <w:tblPr>
-        <w:tblW w:w="10454" w:type="dxa"/>
-        <w:tblBorders>
-          <w:top w:val="nil"/>
-          <w:left w:val="nil"/>
-          <w:bottom w:val="nil"/>
-          <w:right w:val="nil"/>
-          <w:insideH w:val="nil"/>
-          <w:insideV w:val="nil"/>
-        </w:tblBorders>
-        <w:tblLayout w:type="fixed"/>
-        <w:tblLook w:val="04A0" w:firstRow="1" w:lastRow="0" w:firstColumn="1" w:lastColumn="0" w:noHBand="0" w:noVBand="1"/>
-      </w:tblPr>
-      <w:tblGrid>
-        <w:gridCol w:w="2613"/>
-        <w:gridCol w:w="2613"/>
-        <w:gridCol w:w="2613"/>
-        <w:gridCol w:w="2615"/>
-      </w:tblGrid>
-      <w:tr>
-        <w:trPr>
-          <w:cantSplit/>
-        </w:trPr>
-        <w:tc>
-          <w:tcPr>
-            <w:tcW w:w="2613" w:type="dxa"/>
-            <w:tcBorders>
-              <w:top w:val="single" w:sz="6" w:space="0" w:color="E4E0D8"/>
-              <w:left w:val="single" w:sz="6" w:space="0" w:color="E4E0D8"/>
-              <w:bottom w:val="single" w:sz="6" w:space="0" w:color="E4E0D8"/>
-              <w:right w:val="single" w:sz="6" w:space="0" w:color="E4E0D8"/>
-            </w:tcBorders>
-            <w:shd w:val="clear" w:color="auto" w:fill="FBFAF8"/>
-            <w:tcMar>
-              <w:top w:w="115" w:type="dxa"/>
-              <w:left w:w="150" w:type="dxa"/>
-              <w:bottom w:w="105" w:type="dxa"/>
-              <w:right w:w="120" w:type="dxa"/>
-            </w:tcMar>
-          </w:tcPr>
-          <w:p>
-            <w:pPr>
-              <w:keepNext/>
-              <w:keepLines/>
-              <w:spacing w:after="70" w:line="440" w:lineRule="exact"/>
-            </w:pPr>
-            <w:r>
-              <w:rPr>
-                <w:rFonts w:ascii="Spectral Light" w:eastAsia="Spectral Light" w:hAnsi="Spectral Light" w:cs="Spectral Light"/>
-                <w:color w:val="2C4A66"/>
-                <w:sz w:val="42"/>
-              </w:rPr>
-              <w:t>8</w:t>
-            </w:r>
-          </w:p>
-          <w:p>
-            <w:pPr>
-              <w:keepLines/>
-              <w:spacing w:line="184" w:lineRule="exact"/>
-            </w:pPr>
-            <w:r>
-              <w:rPr>
-                <w:b/>
-                <w:color w:val="7A736A"/>
-                <w:spacing w:val="17"/>
-                <w:sz w:val="14"/>
-              </w:rPr>
-              <w:t>ISSUED PATENTS</w:t>
-            </w:r>
-          </w:p>
-        </w:tc>
-        <w:tc>
-          <w:tcPr>
-            <w:tcW w:w="2613" w:type="dxa"/>
-            <w:tcBorders>
-              <w:top w:val="single" w:sz="6" w:space="0" w:color="E4E0D8"/>
-              <w:left w:val="single" w:sz="6" w:space="0" w:color="E4E0D8"/>
-              <w:bottom w:val="single" w:sz="6" w:space="0" w:color="E4E0D8"/>
-              <w:right w:val="single" w:sz="6" w:space="0" w:color="E4E0D8"/>
-            </w:tcBorders>
-            <w:shd w:val="clear" w:color="auto" w:fill="FBFAF8"/>
-            <w:tcMar>
-              <w:top w:w="115" w:type="dxa"/>
-              <w:left w:w="150" w:type="dxa"/>
-              <w:bottom w:w="105" w:type="dxa"/>
-              <w:right w:w="120" w:type="dxa"/>
-            </w:tcMar>
-          </w:tcPr>
-          <w:p>
-            <w:pPr>
-              <w:keepNext/>
-              <w:keepLines/>
-              <w:spacing w:after="70" w:line="440" w:lineRule="exact"/>
-            </w:pPr>
-            <w:r>
-              <w:rPr>
-                <w:rFonts w:ascii="Spectral Light" w:eastAsia="Spectral Light" w:hAnsi="Spectral Light" w:cs="Spectral Light"/>
-                <w:color w:val="2C4A66"/>
-                <w:sz w:val="42"/>
-              </w:rPr>
-              <w:t>10</w:t>
-            </w:r>
-          </w:p>
-          <w:p>
-            <w:pPr>
-              <w:keepLines/>
-              <w:spacing w:line="184" w:lineRule="exact"/>
-            </w:pPr>
-            <w:r>
-              <w:rPr>
-                <w:b/>
-                <w:color w:val="7A736A"/>
-                <w:spacing w:val="17"/>
-                <w:sz w:val="14"/>
-              </w:rPr>
-              <w:t>PENDING APPLICATIONS</w:t>
-            </w:r>
-          </w:p>
-        </w:tc>
-        <w:tc>
-          <w:tcPr>
-            <w:tcW w:w="2613" w:type="dxa"/>
-            <w:tcBorders>
-              <w:top w:val="single" w:sz="6" w:space="0" w:color="E4E0D8"/>
-              <w:left w:val="single" w:sz="6" w:space="0" w:color="E4E0D8"/>
-              <w:bottom w:val="single" w:sz="6" w:space="0" w:color="E4E0D8"/>
-              <w:right w:val="single" w:sz="6" w:space="0" w:color="E4E0D8"/>
-            </w:tcBorders>
-            <w:shd w:val="clear" w:color="auto" w:fill="FBFAF8"/>
-            <w:tcMar>
-              <w:top w:w="115" w:type="dxa"/>
-              <w:left w:w="150" w:type="dxa"/>
-              <w:bottom w:w="105" w:type="dxa"/>
-              <w:right w:w="120" w:type="dxa"/>
-            </w:tcMar>
-          </w:tcPr>
-          <w:p>
-            <w:pPr>
-              <w:keepNext/>
-              <w:keepLines/>
-              <w:spacing w:after="70" w:line="440" w:lineRule="exact"/>
-            </w:pPr>
-            <w:r>
-              <w:rPr>
-                <w:rFonts w:ascii="Spectral Light" w:eastAsia="Spectral Light" w:hAnsi="Spectral Light" w:cs="Spectral Light"/>
-                <w:color w:val="2C4A66"/>
-                <w:sz w:val="42"/>
-              </w:rPr>
-              <w:t>4</w:t>
-            </w:r>
-          </w:p>
-          <w:p>
-            <w:pPr>
-              <w:keepLines/>
-              <w:spacing w:line="184" w:lineRule="exact"/>
-            </w:pPr>
-            <w:r>
-              <w:rPr>
-                <w:b/>
-                <w:color w:val="7A736A"/>
-                <w:spacing w:val="17"/>
-                <w:sz w:val="14"/>
-              </w:rPr>
-              <w:t>PUBLICATIONS</w:t>
-            </w:r>
-          </w:p>
-        </w:tc>
-        <w:tc>
-          <w:tcPr>
-            <w:tcW w:w="2615" w:type="dxa"/>
-            <w:tcBorders>
-              <w:top w:val="single" w:sz="6" w:space="0" w:color="E4E0D8"/>
-              <w:left w:val="single" w:sz="6" w:space="0" w:color="E4E0D8"/>
-              <w:bottom w:val="single" w:sz="6" w:space="0" w:color="E4E0D8"/>
-              <w:right w:val="single" w:sz="6" w:space="0" w:color="E4E0D8"/>
-            </w:tcBorders>
-            <w:shd w:val="clear" w:color="auto" w:fill="FBFAF8"/>
-            <w:tcMar>
-              <w:top w:w="115" w:type="dxa"/>
-              <w:left w:w="150" w:type="dxa"/>
-              <w:bottom w:w="105" w:type="dxa"/>
-              <w:right w:w="120" w:type="dxa"/>
-            </w:tcMar>
-          </w:tcPr>
-          <w:p>
-            <w:pPr>
-              <w:keepNext/>
-              <w:keepLines/>
-              <w:spacing w:after="70" w:line="440" w:lineRule="exact"/>
-            </w:pPr>
-            <w:r>
-              <w:rPr>
-                <w:rFonts w:ascii="Spectral Light" w:eastAsia="Spectral Light" w:hAnsi="Spectral Light" w:cs="Spectral Light"/>
-                <w:color w:val="2C4A66"/>
-                <w:sz w:val="42"/>
-              </w:rPr>
-              <w:t>3</w:t>
-            </w:r>
-          </w:p>
-          <w:p>
-            <w:pPr>
-              <w:keepLines/>
-              <w:spacing w:line="184" w:lineRule="exact"/>
-            </w:pPr>
-            <w:r>
-              <w:rPr>
-                <w:b/>
-                <w:color w:val="7A736A"/>
-                <w:spacing w:val="17"/>
-                <w:sz w:val="14"/>
-              </w:rPr>
-              <w:t>STANDARDS CONTRIBUTIONS</w:t>
-            </w:r>
-          </w:p>
-        </w:tc>
-      </w:tr>
-    </w:tbl>
     <w:p>
       <w:pPr>
         <w:keepNext/>
@@ -1754,8 +2368,8 @@
         <w:tblLook w:val="04A0" w:firstRow="1" w:lastRow="0" w:firstColumn="1" w:lastColumn="0" w:noHBand="0" w:noVBand="1"/>
       </w:tblPr>
       <w:tblGrid>
-        <w:gridCol w:w="7200"/>
-        <w:gridCol w:w="3254"/>
+        <w:gridCol w:w="7830"/>
+        <w:gridCol w:w="2624"/>
       </w:tblGrid>
       <w:tr>
         <w:trPr>
@@ -1763,7 +2377,7 @@
         </w:trPr>
         <w:tc>
           <w:tcPr>
-            <w:tcW w:w="7200" w:type="dxa"/>
+            <w:tcW w:w="7830" w:type="dxa"/>
             <w:tcBorders>
               <w:top w:val="single" w:sz="5" w:space="0" w:color="ECE8E1"/>
               <w:bottom w:val="single" w:sz="5" w:space="0" w:color="ECE8E1"/>
@@ -1784,13 +2398,49 @@
               <w:rPr>
                 <w:sz w:val="18"/>
               </w:rPr>
-              <w:t>“System for generating a non-fungible token…”</w:t>
+              <w:t>“System for generating a non-fungible token</w:t>
+            </w:r>
+            <w:r>
+              <w:rPr>
+                <w:sz w:val="18"/>
+              </w:rPr>
+              <w:t xml:space="preserve"> </w:t>
+            </w:r>
+            <w:r>
+              <w:rPr>
+                <w:sz w:val="18"/>
+              </w:rPr>
+              <w:t>including mutable and immutable at</w:t>
+            </w:r>
+            <w:r>
+              <w:rPr>
+                <w:sz w:val="18"/>
+              </w:rPr>
+              <w:t>tribute</w:t>
+            </w:r>
+            <w:r>
+              <w:rPr>
+                <w:sz w:val="18"/>
+              </w:rPr>
+              <w:t>s</w:t>
+            </w:r>
+            <w:r>
+              <w:rPr>
+                <w:sz w:val="18"/>
+              </w:rPr>
+              <w:t xml:space="preserve"> </w:t>
+            </w:r>
+            <w:r>
+              <w:rPr>
+                <w:sz w:val="18"/>
+              </w:rPr>
+              <w:t>…”</w:t>
             </w:r>
           </w:p>
         </w:tc>
         <w:tc>
           <w:tcPr>
-            <w:tcW w:w="3254" w:type="dxa"/>
+            <w:tcW w:w="2624" w:type="dxa"/>
             <w:tcBorders>
               <w:top w:val="single" w:sz="5" w:space="0" w:color="ECE8E1"/>
               <w:bottom w:val="single" w:sz="5" w:space="0" w:color="ECE8E1"/>
@@ -1808,7 +2458,7 @@
               <w:spacing w:line="224" w:lineRule="exact"/>
               <w:jc w:val="right"/>
             </w:pPr>
-            <w:hyperlink r:id="rId14" w:history="1">
+            <w:hyperlink r:id="rId10" w:history="1">
               <w:r>
                 <w:rPr>
                   <w:rFonts w:ascii="IBM Plex Mono" w:eastAsia="IBM Plex Mono" w:hAnsi="IBM Plex Mono" w:cs="IBM Plex Mono"/>
@@ -1835,7 +2485,7 @@
         </w:trPr>
         <w:tc>
           <w:tcPr>
-            <w:tcW w:w="7200" w:type="dxa"/>
+            <w:tcW w:w="7830" w:type="dxa"/>
             <w:tcBorders>
               <w:bottom w:val="single" w:sz="5" w:space="0" w:color="ECE8E1"/>
             </w:tcBorders>
@@ -1861,7 +2511,7 @@
         </w:tc>
         <w:tc>
           <w:tcPr>
-            <w:tcW w:w="3254" w:type="dxa"/>
+            <w:tcW w:w="2624" w:type="dxa"/>
             <w:tcBorders>
               <w:bottom w:val="single" w:sz="5" w:space="0" w:color="ECE8E1"/>
             </w:tcBorders>
@@ -1878,7 +2528,7 @@
               <w:spacing w:line="224" w:lineRule="exact"/>
               <w:jc w:val="right"/>
             </w:pPr>
-            <w:hyperlink r:id="rId15" w:history="1">
+            <w:hyperlink r:id="rId11" w:history="1">
               <w:r>
                 <w:rPr>
                   <w:rFonts w:ascii="IBM Plex Mono" w:eastAsia="IBM Plex Mono" w:hAnsi="IBM Plex Mono" w:cs="IBM Plex Mono"/>
@@ -1905,7 +2555,7 @@
         </w:trPr>
         <w:tc>
           <w:tcPr>
-            <w:tcW w:w="7200" w:type="dxa"/>
+            <w:tcW w:w="7830" w:type="dxa"/>
             <w:tcBorders>
               <w:bottom w:val="single" w:sz="5" w:space="0" w:color="ECE8E1"/>
             </w:tcBorders>
@@ -1931,7 +2581,7 @@
         </w:tc>
         <w:tc>
           <w:tcPr>
-            <w:tcW w:w="3254" w:type="dxa"/>
+            <w:tcW w:w="2624" w:type="dxa"/>
             <w:tcBorders>
               <w:bottom w:val="single" w:sz="5" w:space="0" w:color="ECE8E1"/>
             </w:tcBorders>
@@ -1948,7 +2598,7 @@
               <w:spacing w:line="224" w:lineRule="exact"/>
               <w:jc w:val="right"/>
             </w:pPr>
-            <w:hyperlink r:id="rId16" w:history="1">
+            <w:hyperlink r:id="rId12" w:history="1">
               <w:r>
                 <w:rPr>
                   <w:rFonts w:ascii="IBM Plex Mono" w:eastAsia="IBM Plex Mono" w:hAnsi="IBM Plex Mono" w:cs="IBM Plex Mono"/>
@@ -1975,7 +2625,7 @@
         </w:trPr>
         <w:tc>
           <w:tcPr>
-            <w:tcW w:w="7200" w:type="dxa"/>
+            <w:tcW w:w="7830" w:type="dxa"/>
             <w:tcBorders>
               <w:bottom w:val="single" w:sz="5" w:space="0" w:color="ECE8E1"/>
             </w:tcBorders>
@@ -2001,7 +2651,7 @@
         </w:tc>
         <w:tc>
           <w:tcPr>
-            <w:tcW w:w="3254" w:type="dxa"/>
+            <w:tcW w:w="2624" w:type="dxa"/>
             <w:tcBorders>
               <w:bottom w:val="single" w:sz="5" w:space="0" w:color="ECE8E1"/>
             </w:tcBorders>
@@ -2018,7 +2668,7 @@
               <w:spacing w:line="224" w:lineRule="exact"/>
               <w:jc w:val="right"/>
             </w:pPr>
-            <w:hyperlink r:id="rId17" w:history="1">
+            <w:hyperlink r:id="rId13" w:history="1">
               <w:r>
                 <w:rPr>
                   <w:rFonts w:ascii="IBM Plex Mono" w:eastAsia="IBM Plex Mono" w:hAnsi="IBM Plex Mono" w:cs="IBM Plex Mono"/>
@@ -2045,7 +2695,7 @@
         </w:trPr>
         <w:tc>
           <w:tcPr>
-            <w:tcW w:w="7200" w:type="dxa"/>
+            <w:tcW w:w="7830" w:type="dxa"/>
             <w:tcBorders>
               <w:bottom w:val="single" w:sz="5" w:space="0" w:color="ECE8E1"/>
             </w:tcBorders>
@@ -2071,7 +2721,7 @@
         </w:tc>
         <w:tc>
           <w:tcPr>
-            <w:tcW w:w="3254" w:type="dxa"/>
+            <w:tcW w:w="2624" w:type="dxa"/>
             <w:tcBorders>
               <w:bottom w:val="single" w:sz="5" w:space="0" w:color="ECE8E1"/>
             </w:tcBorders>
@@ -2088,7 +2738,7 @@
               <w:spacing w:line="224" w:lineRule="exact"/>
               <w:jc w:val="right"/>
             </w:pPr>
-            <w:hyperlink r:id="rId18" w:history="1">
+            <w:hyperlink r:id="rId14" w:history="1">
               <w:r>
                 <w:rPr>
                   <w:rFonts w:ascii="IBM Plex Mono" w:eastAsia="IBM Plex Mono" w:hAnsi="IBM Plex Mono" w:cs="IBM Plex Mono"/>
@@ -2115,7 +2765,7 @@
         </w:trPr>
         <w:tc>
           <w:tcPr>
-            <w:tcW w:w="7200" w:type="dxa"/>
+            <w:tcW w:w="7830" w:type="dxa"/>
             <w:tcBorders>
               <w:bottom w:val="single" w:sz="5" w:space="0" w:color="ECE8E1"/>
             </w:tcBorders>
@@ -2141,7 +2791,7 @@
         </w:tc>
         <w:tc>
           <w:tcPr>
-            <w:tcW w:w="3254" w:type="dxa"/>
+            <w:tcW w:w="2624" w:type="dxa"/>
             <w:tcBorders>
               <w:bottom w:val="single" w:sz="5" w:space="0" w:color="ECE8E1"/>
             </w:tcBorders>
@@ -2158,7 +2808,7 @@
               <w:spacing w:line="224" w:lineRule="exact"/>
               <w:jc w:val="right"/>
             </w:pPr>
-            <w:hyperlink r:id="rId19" w:history="1">
+            <w:hyperlink r:id="rId15" w:history="1">
               <w:r>
                 <w:rPr>
                   <w:rFonts w:ascii="IBM Plex Mono" w:eastAsia="IBM Plex Mono" w:hAnsi="IBM Plex Mono" w:cs="IBM Plex Mono"/>
@@ -2185,7 +2835,7 @@
         </w:trPr>
         <w:tc>
           <w:tcPr>
-            <w:tcW w:w="7200" w:type="dxa"/>
+            <w:tcW w:w="7830" w:type="dxa"/>
             <w:tcBorders>
               <w:bottom w:val="single" w:sz="5" w:space="0" w:color="ECE8E1"/>
             </w:tcBorders>
@@ -2211,7 +2861,7 @@
         </w:tc>
         <w:tc>
           <w:tcPr>
-            <w:tcW w:w="3254" w:type="dxa"/>
+            <w:tcW w:w="2624" w:type="dxa"/>
             <w:tcBorders>
               <w:bottom w:val="single" w:sz="5" w:space="0" w:color="ECE8E1"/>
             </w:tcBorders>
@@ -2228,7 +2878,7 @@
               <w:spacing w:line="224" w:lineRule="exact"/>
               <w:jc w:val="right"/>
             </w:pPr>
-            <w:hyperlink r:id="rId20" w:history="1">
+            <w:hyperlink r:id="rId16" w:history="1">
               <w:r>
                 <w:rPr>
                   <w:rFonts w:ascii="IBM Plex Mono" w:eastAsia="IBM Plex Mono" w:hAnsi="IBM Plex Mono" w:cs="IBM Plex Mono"/>
@@ -2255,7 +2905,7 @@
         </w:trPr>
         <w:tc>
           <w:tcPr>
-            <w:tcW w:w="7200" w:type="dxa"/>
+            <w:tcW w:w="7830" w:type="dxa"/>
             <w:tcBorders>
               <w:bottom w:val="single" w:sz="5" w:space="0" w:color="ECE8E1"/>
             </w:tcBorders>
@@ -2281,7 +2931,7 @@
         </w:tc>
         <w:tc>
           <w:tcPr>
-            <w:tcW w:w="3254" w:type="dxa"/>
+            <w:tcW w:w="2624" w:type="dxa"/>
             <w:tcBorders>
               <w:bottom w:val="single" w:sz="5" w:space="0" w:color="ECE8E1"/>
             </w:tcBorders>
@@ -2298,7 +2948,7 @@
               <w:spacing w:line="224" w:lineRule="exact"/>
               <w:jc w:val="right"/>
             </w:pPr>
-            <w:hyperlink r:id="rId21" w:history="1">
+            <w:hyperlink r:id="rId17" w:history="1">
               <w:r>
                 <w:rPr>
                   <w:rFonts w:ascii="IBM Plex Mono" w:eastAsia="IBM Plex Mono" w:hAnsi="IBM Plex Mono" w:cs="IBM Plex Mono"/>
@@ -2502,7 +3152,33 @@
               <w:rPr>
                 <w:sz w:val="18"/>
               </w:rPr>
-              <w:t>“Systems and methods of a progressive cloud …”</w:t>
+              <w:t xml:space="preserve">“Systems and methods of a progressive </w:t>
+            </w:r>
+            <w:proofErr w:type="gramStart"/>
+            <w:r>
+              <w:rPr>
+                <w:sz w:val="18"/>
+              </w:rPr>
+              <w:t xml:space="preserve">cloud </w:t>
+            </w:r>
+            <w:r>
+              <w:rPr>
+                <w:sz w:val="18"/>
+              </w:rPr>
+              <w:t>based</w:t>
+            </w:r>
+            <w:proofErr w:type="gramEnd"/>
+            <w:r>
+              <w:rPr>
+                <w:sz w:val="18"/>
+              </w:rPr>
+              <w:t xml:space="preserve"> architecture</w:t>
+            </w:r>
+            <w:r>
+              <w:rPr>
+                <w:sz w:val="18"/>
+              </w:rPr>
+              <w:t>”</w:t>
             </w:r>
           </w:p>
         </w:tc>
@@ -2562,7 +3238,19 @@
               <w:rPr>
                 <w:sz w:val="18"/>
               </w:rPr>
-              <w:t>“Non-fungible token system generating tethered …”</w:t>
+              <w:t xml:space="preserve">“Non-fungible token system generating tethered </w:t>
+            </w:r>
+            <w:r>
+              <w:rPr>
+                <w:sz w:val="18"/>
+              </w:rPr>
+              <w:t xml:space="preserve">and reference non-fungible tokens </w:t>
+            </w:r>
+            <w:r>
+              <w:rPr>
+                <w:sz w:val="18"/>
+              </w:rPr>
+              <w:t>…”</w:t>
             </w:r>
           </w:p>
         </w:tc>
@@ -2622,7 +3310,22 @@
               <w:rPr>
                 <w:sz w:val="18"/>
               </w:rPr>
-              <w:t>“Non-fungible token system for digital wallet processing …”</w:t>
+              <w:t>“Non-fungible token system for digital wallet processing</w:t>
+            </w:r>
+            <w:r>
+              <w:t xml:space="preserve"> </w:t>
+            </w:r>
+            <w:r>
+              <w:rPr>
+                <w:sz w:val="18"/>
+              </w:rPr>
+              <w:t>and related methods</w:t>
+            </w:r>
+            <w:r>
+              <w:rPr>
+                <w:sz w:val="18"/>
+              </w:rPr>
+              <w:t>”</w:t>
             </w:r>
           </w:p>
         </w:tc>
@@ -2682,7 +3385,25 @@
               <w:rPr>
                 <w:sz w:val="18"/>
               </w:rPr>
-              <w:t>“Systems and methods for utilizing a Time-To-Truth (TTT) …”</w:t>
+              <w:t xml:space="preserve">“Systems and methods for utilizing a Time-To-Truth (TTT) </w:t>
+            </w:r>
+            <w:r>
+              <w:rPr>
+                <w:sz w:val="18"/>
+              </w:rPr>
+              <w:t>metric for knowledge</w:t>
+            </w:r>
+            <w:r>
+              <w:rPr>
+                <w:sz w:val="18"/>
+              </w:rPr>
+              <w:t xml:space="preserve"> </w:t>
+            </w:r>
+            <w:r>
+              <w:rPr>
+                <w:sz w:val="18"/>
+              </w:rPr>
+              <w:t>…”</w:t>
             </w:r>
           </w:p>
         </w:tc>
@@ -2742,7 +3463,25 @@
               <w:rPr>
                 <w:sz w:val="18"/>
               </w:rPr>
-              <w:t>“Systems and methods for using AI models …”</w:t>
+              <w:t xml:space="preserve">“Systems and methods for using AI models </w:t>
+            </w:r>
+            <w:r>
+              <w:rPr>
+                <w:sz w:val="18"/>
+              </w:rPr>
+              <w:t>t</w:t>
+            </w:r>
+            <w:r>
+              <w:rPr>
+                <w:sz w:val="18"/>
+              </w:rPr>
+              <w:t>o maintain and update provider</w:t>
+            </w:r>
+            <w:r>
+              <w:rPr>
+                <w:sz w:val="18"/>
+              </w:rPr>
+              <w:t>…”</w:t>
             </w:r>
           </w:p>
         </w:tc>
@@ -2862,7 +3601,19 @@
               <w:rPr>
                 <w:sz w:val="18"/>
               </w:rPr>
-              <w:t>“Systems and methods for federated knowledge …”</w:t>
+              <w:t xml:space="preserve">“Systems and methods for federated knowledge </w:t>
+            </w:r>
+            <w:r>
+              <w:rPr>
+                <w:sz w:val="18"/>
+              </w:rPr>
+              <w:t>governance</w:t>
+            </w:r>
+            <w:r>
+              <w:rPr>
+                <w:sz w:val="18"/>
+              </w:rPr>
+              <w:t>”</w:t>
             </w:r>
           </w:p>
         </w:tc>
@@ -3213,8 +3964,8 @@
     </w:tbl>
     <w:p/>
     <w:sectPr>
-      <w:footerReference w:type="even" r:id="rId10"/>
-      <w:footerReference w:type="default" r:id="rId11"/>
+      <w:footerReference w:type="even" r:id="rId18"/>
+      <w:footerReference w:type="default" r:id="rId19"/>
       <w:pgSz w:w="12240" w:h="15840"/>
       <w:pgMar w:top="792" w:right="893" w:bottom="792" w:left="893" w:header="360" w:footer="374" w:gutter="0"/>
       <w:cols w:space="720"/>
@@ -3225,7 +3976,7 @@
 </file>
 
 <file path=word/endnotes.xml><?xml version="1.0" encoding="utf-8"?>
-<w:endnotes xmlns:wpc="http://schemas.microsoft.com/office/word/2010/wordprocessingCanvas" xmlns:cx="http://schemas.microsoft.com/office/drawing/2014/chartex" xmlns:cx1="http://schemas.microsoft.com/office/drawing/2015/9/8/chartex" xmlns:cx2="http://schemas.microsoft.com/office/drawing/2015/10/21/chartex" xmlns:cx3="http://schemas.microsoft.com/office/drawing/2016/5/9/chartex" xmlns:cx4="http://schemas.microsoft.com/office/drawing/2016/5/10/chartex" xmlns:cx5="http://schemas.microsoft.com/office/drawing/2016/5/11/chartex" xmlns:cx6="http://schemas.microsoft.com/office/drawing/2016/5/12/chartex" xmlns:cx7="http://schemas.microsoft.com/office/drawing/2016/5/13/chartex" xmlns:cx8="http://schemas.microsoft.com/office/drawing/2016/5/14/chartex" xmlns:mc="http://schemas.openxmlformats.org/markup-compatibility/2006" xmlns:aink="http://schemas.microsoft.com/office/drawing/2016/ink" xmlns:am3d="http://schemas.microsoft.com/office/drawing/2017/model3d" xmlns:o="urn:schemas-microsoft-com:office:office" xmlns:oel="http://schemas.microsoft.com/office/2019/extlst" xmlns:r="http://schemas.openxmlformats.org/officeDocument/2006/relationships" xmlns:m="http://schemas.openxmlformats.org/officeDocument/2006/math" xmlns:v="urn:schemas-microsoft-com:vml" xmlns:wp14="http://schemas.microsoft.com/office/word/2010/wordprocessingDrawing" xmlns:wp="http://schemas.openxmlformats.org/drawingml/2006/wordprocessingDrawing" xmlns:w10="urn:schemas-microsoft-com:office:word" xmlns:w="http://schemas.openxmlformats.org/wordprocessingml/2006/main" xmlns:w14="http://schemas.microsoft.com/office/word/2010/wordml" xmlns:w15="http://schemas.microsoft.com/office/word/2012/wordml" xmlns:w16cex="http://schemas.microsoft.com/office/word/2018/wordml/cex" xmlns:w16cid="http://schemas.microsoft.com/office/word/2016/wordml/cid" xmlns:w16="http://schemas.microsoft.com/office/word/2018/wordml" xmlns:w16du="http://schemas.microsoft.com/office/word/2023/wordml/word16du" xmlns:w16sdtdh="http://schemas.microsoft.com/office/word/2020/wordml/sdtdatahash" xmlns:w16sdtfl="http://schemas.microsoft.com/office/word/2024/wordml/sdtformatlock" xmlns:w16se="http://schemas.microsoft.com/office/word/2015/wordml/symex" xmlns:wpg="http://schemas.microsoft.com/office/word/2010/wordprocessingGroup" xmlns:wpi="http://schemas.microsoft.com/office/word/2010/wordprocessingInk" xmlns:wne="http://schemas.microsoft.com/office/word/2006/wordml" xmlns:wps="http://schemas.microsoft.com/office/word/2010/wordprocessingShape" mc:Ignorable="w14 w15 w16se w16cid w16 w16cex w16sdtdh w16sdtfl w16du wp14">
+<w:endnotes xmlns:wpc="http://schemas.microsoft.com/office/word/2010/wordprocessingCanvas" xmlns:cx="http://schemas.microsoft.com/office/drawing/2014/chartex" xmlns:cx1="http://schemas.microsoft.com/office/drawing/2015/9/8/chartex" xmlns:cx2="http://schemas.microsoft.com/office/drawing/2015/10/21/chartex" xmlns:cx3="http://schemas.microsoft.com/office/drawing/2016/5/9/chartex" xmlns:cx4="http://schemas.microsoft.com/office/drawing/2016/5/10/chartex" xmlns:cx5="http://schemas.microsoft.com/office/drawing/2016/5/11/chartex" xmlns:cx6="http://schemas.microsoft.com/office/drawing/2016/5/12/chartex" xmlns:cx7="http://schemas.microsoft.com/office/drawing/2016/5/13/chartex" xmlns:cx8="http://schemas.microsoft.com/office/drawing/2016/5/14/chartex" xmlns:mc="http://schemas.openxmlformats.org/markup-compatibility/2006" xmlns:aink="http://schemas.microsoft.com/office/drawing/2016/ink" xmlns:am3d="http://schemas.microsoft.com/office/drawing/2017/model3d" xmlns:o="urn:schemas-microsoft-com:office:office" xmlns:oel="http://schemas.microsoft.com/office/2019/extlst" xmlns:r="http://schemas.openxmlformats.org/officeDocument/2006/relationships" xmlns:m="http://schemas.openxmlformats.org/officeDocument/2006/math" xmlns:v="urn:schemas-microsoft-com:vml" xmlns:wp14="http://schemas.microsoft.com/office/word/2010/wordprocessingDrawing" xmlns:wp="http://schemas.openxmlformats.org/drawingml/2006/wordprocessingDrawing" xmlns:w10="urn:schemas-microsoft-com:office:word" xmlns:w="http://schemas.openxmlformats.org/wordprocessingml/2006/main" xmlns:w14="http://schemas.microsoft.com/office/word/2010/wordml" xmlns:w15="http://schemas.microsoft.com/office/word/2012/wordml" xmlns:w16cei="http://schemas.microsoft.com/office/word/2026/wordml/cei" xmlns:w16cex="http://schemas.microsoft.com/office/word/2018/wordml/cex" xmlns:w16cid="http://schemas.microsoft.com/office/word/2016/wordml/cid" xmlns:w16="http://schemas.microsoft.com/office/word/2018/wordml" xmlns:w16du="http://schemas.microsoft.com/office/word/2023/wordml/word16du" xmlns:w16sdtdh="http://schemas.microsoft.com/office/word/2020/wordml/sdtdatahash" xmlns:w16sdtfl="http://schemas.microsoft.com/office/word/2024/wordml/sdtformatlock" xmlns:w16se="http://schemas.microsoft.com/office/word/2015/wordml/symex" xmlns:wpg="http://schemas.microsoft.com/office/word/2010/wordprocessingGroup" xmlns:wpi="http://schemas.microsoft.com/office/word/2010/wordprocessingInk" xmlns:wne="http://schemas.microsoft.com/office/word/2006/wordml" xmlns:wps="http://schemas.microsoft.com/office/word/2010/wordprocessingShape" mc:Ignorable="w14 w15 w16se w16cid w16 w16cex w16sdtdh w16sdtfl w16du wp14">
   <w:endnote w:type="separator" w:id="-1">
     <w:p>
       <w:pPr>
@@ -3250,7 +4001,7 @@
 </file>
 
 <file path=word/footer1.xml><?xml version="1.0" encoding="utf-8"?>
-<w:ftr xmlns:wpc="http://schemas.microsoft.com/office/word/2010/wordprocessingCanvas" xmlns:cx="http://schemas.microsoft.com/office/drawing/2014/chartex" xmlns:cx1="http://schemas.microsoft.com/office/drawing/2015/9/8/chartex" xmlns:cx2="http://schemas.microsoft.com/office/drawing/2015/10/21/chartex" xmlns:cx3="http://schemas.microsoft.com/office/drawing/2016/5/9/chartex" xmlns:cx4="http://schemas.microsoft.com/office/drawing/2016/5/10/chartex" xmlns:cx5="http://schemas.microsoft.com/office/drawing/2016/5/11/chartex" xmlns:cx6="http://schemas.microsoft.com/office/drawing/2016/5/12/chartex" xmlns:cx7="http://schemas.microsoft.com/office/drawing/2016/5/13/chartex" xmlns:cx8="http://schemas.microsoft.com/office/drawing/2016/5/14/chartex" xmlns:mc="http://schemas.openxmlformats.org/markup-compatibility/2006" xmlns:aink="http://schemas.microsoft.com/office/drawing/2016/ink" xmlns:am3d="http://schemas.microsoft.com/office/drawing/2017/model3d" xmlns:o="urn:schemas-microsoft-com:office:office" xmlns:oel="http://schemas.microsoft.com/office/2019/extlst" xmlns:r="http://schemas.openxmlformats.org/officeDocument/2006/relationships" xmlns:m="http://schemas.openxmlformats.org/officeDocument/2006/math" xmlns:v="urn:schemas-microsoft-com:vml" xmlns:wp14="http://schemas.microsoft.com/office/word/2010/wordprocessingDrawing" xmlns:wp="http://schemas.openxmlformats.org/drawingml/2006/wordprocessingDrawing" xmlns:w10="urn:schemas-microsoft-com:office:word" xmlns:w="http://schemas.openxmlformats.org/wordprocessingml/2006/main" xmlns:w14="http://schemas.microsoft.com/office/word/2010/wordml" xmlns:w15="http://schemas.microsoft.com/office/word/2012/wordml" xmlns:w16cex="http://schemas.microsoft.com/office/word/2018/wordml/cex" xmlns:w16cid="http://schemas.microsoft.com/office/word/2016/wordml/cid" xmlns:w16="http://schemas.microsoft.com/office/word/2018/wordml" xmlns:w16du="http://schemas.microsoft.com/office/word/2023/wordml/word16du" xmlns:w16sdtdh="http://schemas.microsoft.com/office/word/2020/wordml/sdtdatahash" xmlns:w16sdtfl="http://schemas.microsoft.com/office/word/2024/wordml/sdtformatlock" xmlns:w16se="http://schemas.microsoft.com/office/word/2015/wordml/symex" xmlns:wpg="http://schemas.microsoft.com/office/word/2010/wordprocessingGroup" xmlns:wpi="http://schemas.microsoft.com/office/word/2010/wordprocessingInk" xmlns:wne="http://schemas.microsoft.com/office/word/2006/wordml" xmlns:wps="http://schemas.microsoft.com/office/word/2010/wordprocessingShape" mc:Ignorable="w14 w15 w16se w16cid w16 w16cex w16sdtdh w16sdtfl w16du wp14">
+<w:ftr xmlns:wpc="http://schemas.microsoft.com/office/word/2010/wordprocessingCanvas" xmlns:cx="http://schemas.microsoft.com/office/drawing/2014/chartex" xmlns:cx1="http://schemas.microsoft.com/office/drawing/2015/9/8/chartex" xmlns:cx2="http://schemas.microsoft.com/office/drawing/2015/10/21/chartex" xmlns:cx3="http://schemas.microsoft.com/office/drawing/2016/5/9/chartex" xmlns:cx4="http://schemas.microsoft.com/office/drawing/2016/5/10/chartex" xmlns:cx5="http://schemas.microsoft.com/office/drawing/2016/5/11/chartex" xmlns:cx6="http://schemas.microsoft.com/office/drawing/2016/5/12/chartex" xmlns:cx7="http://schemas.microsoft.com/office/drawing/2016/5/13/chartex" xmlns:cx8="http://schemas.microsoft.com/office/drawing/2016/5/14/chartex" xmlns:mc="http://schemas.openxmlformats.org/markup-compatibility/2006" xmlns:aink="http://schemas.microsoft.com/office/drawing/2016/ink" xmlns:am3d="http://schemas.microsoft.com/office/drawing/2017/model3d" xmlns:o="urn:schemas-microsoft-com:office:office" xmlns:oel="http://schemas.microsoft.com/office/2019/extlst" xmlns:r="http://schemas.openxmlformats.org/officeDocument/2006/relationships" xmlns:m="http://schemas.openxmlformats.org/officeDocument/2006/math" xmlns:v="urn:schemas-microsoft-com:vml" xmlns:wp14="http://schemas.microsoft.com/office/word/2010/wordprocessingDrawing" xmlns:wp="http://schemas.openxmlformats.org/drawingml/2006/wordprocessingDrawing" xmlns:w10="urn:schemas-microsoft-com:office:word" xmlns:w="http://schemas.openxmlformats.org/wordprocessingml/2006/main" xmlns:w14="http://schemas.microsoft.com/office/word/2010/wordml" xmlns:w15="http://schemas.microsoft.com/office/word/2012/wordml" xmlns:w16cei="http://schemas.microsoft.com/office/word/2026/wordml/cei" xmlns:w16cex="http://schemas.microsoft.com/office/word/2018/wordml/cex" xmlns:w16cid="http://schemas.microsoft.com/office/word/2016/wordml/cid" xmlns:w16="http://schemas.microsoft.com/office/word/2018/wordml" xmlns:w16du="http://schemas.microsoft.com/office/word/2023/wordml/word16du" xmlns:w16sdtdh="http://schemas.microsoft.com/office/word/2020/wordml/sdtdatahash" xmlns:w16sdtfl="http://schemas.microsoft.com/office/word/2024/wordml/sdtformatlock" xmlns:w16se="http://schemas.microsoft.com/office/word/2015/wordml/symex" xmlns:wpg="http://schemas.microsoft.com/office/word/2010/wordprocessingGroup" xmlns:wpi="http://schemas.microsoft.com/office/word/2010/wordprocessingInk" xmlns:wne="http://schemas.microsoft.com/office/word/2006/wordml" xmlns:wps="http://schemas.microsoft.com/office/word/2010/wordprocessingShape" mc:Ignorable="w14 w15 w16se w16cid w16 w16cex w16sdtdh w16sdtfl w16du wp14">
   <w:p>
     <w:pPr>
       <w:pStyle w:val="Footer"/>
@@ -3286,7 +4037,7 @@
 </file>
 
 <file path=word/footer2.xml><?xml version="1.0" encoding="utf-8"?>
-<w:ftr xmlns:wpc="http://schemas.microsoft.com/office/word/2010/wordprocessingCanvas" xmlns:cx="http://schemas.microsoft.com/office/drawing/2014/chartex" xmlns:cx1="http://schemas.microsoft.com/office/drawing/2015/9/8/chartex" xmlns:cx2="http://schemas.microsoft.com/office/drawing/2015/10/21/chartex" xmlns:cx3="http://schemas.microsoft.com/office/drawing/2016/5/9/chartex" xmlns:cx4="http://schemas.microsoft.com/office/drawing/2016/5/10/chartex" xmlns:cx5="http://schemas.microsoft.com/office/drawing/2016/5/11/chartex" xmlns:cx6="http://schemas.microsoft.com/office/drawing/2016/5/12/chartex" xmlns:cx7="http://schemas.microsoft.com/office/drawing/2016/5/13/chartex" xmlns:cx8="http://schemas.microsoft.com/office/drawing/2016/5/14/chartex" xmlns:mc="http://schemas.openxmlformats.org/markup-compatibility/2006" xmlns:aink="http://schemas.microsoft.com/office/drawing/2016/ink" xmlns:am3d="http://schemas.microsoft.com/office/drawing/2017/model3d" xmlns:o="urn:schemas-microsoft-com:office:office" xmlns:oel="http://schemas.microsoft.com/office/2019/extlst" xmlns:r="http://schemas.openxmlformats.org/officeDocument/2006/relationships" xmlns:m="http://schemas.openxmlformats.org/officeDocument/2006/math" xmlns:v="urn:schemas-microsoft-com:vml" xmlns:wp14="http://schemas.microsoft.com/office/word/2010/wordprocessingDrawing" xmlns:wp="http://schemas.openxmlformats.org/drawingml/2006/wordprocessingDrawing" xmlns:w10="urn:schemas-microsoft-com:office:word" xmlns:w="http://schemas.openxmlformats.org/wordprocessingml/2006/main" xmlns:w14="http://schemas.microsoft.com/office/word/2010/wordml" xmlns:w15="http://schemas.microsoft.com/office/word/2012/wordml" xmlns:w16cex="http://schemas.microsoft.com/office/word/2018/wordml/cex" xmlns:w16cid="http://schemas.microsoft.com/office/word/2016/wordml/cid" xmlns:w16="http://schemas.microsoft.com/office/word/2018/wordml" xmlns:w16du="http://schemas.microsoft.com/office/word/2023/wordml/word16du" xmlns:w16sdtdh="http://schemas.microsoft.com/office/word/2020/wordml/sdtdatahash" xmlns:w16sdtfl="http://schemas.microsoft.com/office/word/2024/wordml/sdtformatlock" xmlns:w16se="http://schemas.microsoft.com/office/word/2015/wordml/symex" xmlns:wpg="http://schemas.microsoft.com/office/word/2010/wordprocessingGroup" xmlns:wpi="http://schemas.microsoft.com/office/word/2010/wordprocessingInk" xmlns:wne="http://schemas.microsoft.com/office/word/2006/wordml" xmlns:wps="http://schemas.microsoft.com/office/word/2010/wordprocessingShape" mc:Ignorable="w14 w15 w16se w16cid w16 w16cex w16sdtdh w16sdtfl w16du wp14">
+<w:ftr xmlns:wpc="http://schemas.microsoft.com/office/word/2010/wordprocessingCanvas" xmlns:cx="http://schemas.microsoft.com/office/drawing/2014/chartex" xmlns:cx1="http://schemas.microsoft.com/office/drawing/2015/9/8/chartex" xmlns:cx2="http://schemas.microsoft.com/office/drawing/2015/10/21/chartex" xmlns:cx3="http://schemas.microsoft.com/office/drawing/2016/5/9/chartex" xmlns:cx4="http://schemas.microsoft.com/office/drawing/2016/5/10/chartex" xmlns:cx5="http://schemas.microsoft.com/office/drawing/2016/5/11/chartex" xmlns:cx6="http://schemas.microsoft.com/office/drawing/2016/5/12/chartex" xmlns:cx7="http://schemas.microsoft.com/office/drawing/2016/5/13/chartex" xmlns:cx8="http://schemas.microsoft.com/office/drawing/2016/5/14/chartex" xmlns:mc="http://schemas.openxmlformats.org/markup-compatibility/2006" xmlns:aink="http://schemas.microsoft.com/office/drawing/2016/ink" xmlns:am3d="http://schemas.microsoft.com/office/drawing/2017/model3d" xmlns:o="urn:schemas-microsoft-com:office:office" xmlns:oel="http://schemas.microsoft.com/office/2019/extlst" xmlns:r="http://schemas.openxmlformats.org/officeDocument/2006/relationships" xmlns:m="http://schemas.openxmlformats.org/officeDocument/2006/math" xmlns:v="urn:schemas-microsoft-com:vml" xmlns:wp14="http://schemas.microsoft.com/office/word/2010/wordprocessingDrawing" xmlns:wp="http://schemas.openxmlformats.org/drawingml/2006/wordprocessingDrawing" xmlns:w10="urn:schemas-microsoft-com:office:word" xmlns:w="http://schemas.openxmlformats.org/wordprocessingml/2006/main" xmlns:w14="http://schemas.microsoft.com/office/word/2010/wordml" xmlns:w15="http://schemas.microsoft.com/office/word/2012/wordml" xmlns:w16cei="http://schemas.microsoft.com/office/word/2026/wordml/cei" xmlns:w16cex="http://schemas.microsoft.com/office/word/2018/wordml/cex" xmlns:w16cid="http://schemas.microsoft.com/office/word/2016/wordml/cid" xmlns:w16="http://schemas.microsoft.com/office/word/2018/wordml" xmlns:w16du="http://schemas.microsoft.com/office/word/2023/wordml/word16du" xmlns:w16sdtdh="http://schemas.microsoft.com/office/word/2020/wordml/sdtdatahash" xmlns:w16sdtfl="http://schemas.microsoft.com/office/word/2024/wordml/sdtformatlock" xmlns:w16se="http://schemas.microsoft.com/office/word/2015/wordml/symex" xmlns:wpg="http://schemas.microsoft.com/office/word/2010/wordprocessingGroup" xmlns:wpi="http://schemas.microsoft.com/office/word/2010/wordprocessingInk" xmlns:wne="http://schemas.microsoft.com/office/word/2006/wordml" xmlns:wps="http://schemas.microsoft.com/office/word/2010/wordprocessingShape" mc:Ignorable="w14 w15 w16se w16cid w16 w16cex w16sdtdh w16sdtfl w16du wp14">
   <w:p>
     <w:pPr>
       <w:pStyle w:val="Footer"/>
@@ -3322,7 +4073,7 @@
 </file>
 
 <file path=word/footnotes.xml><?xml version="1.0" encoding="utf-8"?>
-<w:footnotes xmlns:wpc="http://schemas.microsoft.com/office/word/2010/wordprocessingCanvas" xmlns:cx="http://schemas.microsoft.com/office/drawing/2014/chartex" xmlns:cx1="http://schemas.microsoft.com/office/drawing/2015/9/8/chartex" xmlns:cx2="http://schemas.microsoft.com/office/drawing/2015/10/21/chartex" xmlns:cx3="http://schemas.microsoft.com/office/drawing/2016/5/9/chartex" xmlns:cx4="http://schemas.microsoft.com/office/drawing/2016/5/10/chartex" xmlns:cx5="http://schemas.microsoft.com/office/drawing/2016/5/11/chartex" xmlns:cx6="http://schemas.microsoft.com/office/drawing/2016/5/12/chartex" xmlns:cx7="http://schemas.microsoft.com/office/drawing/2016/5/13/chartex" xmlns:cx8="http://schemas.microsoft.com/office/drawing/2016/5/14/chartex" xmlns:mc="http://schemas.openxmlformats.org/markup-compatibility/2006" xmlns:aink="http://schemas.microsoft.com/office/drawing/2016/ink" xmlns:am3d="http://schemas.microsoft.com/office/drawing/2017/model3d" xmlns:o="urn:schemas-microsoft-com:office:office" xmlns:oel="http://schemas.microsoft.com/office/2019/extlst" xmlns:r="http://schemas.openxmlformats.org/officeDocument/2006/relationships" xmlns:m="http://schemas.openxmlformats.org/officeDocument/2006/math" xmlns:v="urn:schemas-microsoft-com:vml" xmlns:wp14="http://schemas.microsoft.com/office/word/2010/wordprocessingDrawing" xmlns:wp="http://schemas.openxmlformats.org/drawingml/2006/wordprocessingDrawing" xmlns:w10="urn:schemas-microsoft-com:office:word" xmlns:w="http://schemas.openxmlformats.org/wordprocessingml/2006/main" xmlns:w14="http://schemas.microsoft.com/office/word/2010/wordml" xmlns:w15="http://schemas.microsoft.com/office/word/2012/wordml" xmlns:w16cex="http://schemas.microsoft.com/office/word/2018/wordml/cex" xmlns:w16cid="http://schemas.microsoft.com/office/word/2016/wordml/cid" xmlns:w16="http://schemas.microsoft.com/office/word/2018/wordml" xmlns:w16du="http://schemas.microsoft.com/office/word/2023/wordml/word16du" xmlns:w16sdtdh="http://schemas.microsoft.com/office/word/2020/wordml/sdtdatahash" xmlns:w16sdtfl="http://schemas.microsoft.com/office/word/2024/wordml/sdtformatlock" xmlns:w16se="http://schemas.microsoft.com/office/word/2015/wordml/symex" xmlns:wpg="http://schemas.microsoft.com/office/word/2010/wordprocessingGroup" xmlns:wpi="http://schemas.microsoft.com/office/word/2010/wordprocessingInk" xmlns:wne="http://schemas.microsoft.com/office/word/2006/wordml" xmlns:wps="http://schemas.microsoft.com/office/word/2010/wordprocessingShape" mc:Ignorable="w14 w15 w16se w16cid w16 w16cex w16sdtdh w16sdtfl w16du wp14">
+<w:footnotes xmlns:wpc="http://schemas.microsoft.com/office/word/2010/wordprocessingCanvas" xmlns:cx="http://schemas.microsoft.com/office/drawing/2014/chartex" xmlns:cx1="http://schemas.microsoft.com/office/drawing/2015/9/8/chartex" xmlns:cx2="http://schemas.microsoft.com/office/drawing/2015/10/21/chartex" xmlns:cx3="http://schemas.microsoft.com/office/drawing/2016/5/9/chartex" xmlns:cx4="http://schemas.microsoft.com/office/drawing/2016/5/10/chartex" xmlns:cx5="http://schemas.microsoft.com/office/drawing/2016/5/11/chartex" xmlns:cx6="http://schemas.microsoft.com/office/drawing/2016/5/12/chartex" xmlns:cx7="http://schemas.microsoft.com/office/drawing/2016/5/13/chartex" xmlns:cx8="http://schemas.microsoft.com/office/drawing/2016/5/14/chartex" xmlns:mc="http://schemas.openxmlformats.org/markup-compatibility/2006" xmlns:aink="http://schemas.microsoft.com/office/drawing/2016/ink" xmlns:am3d="http://schemas.microsoft.com/office/drawing/2017/model3d" xmlns:o="urn:schemas-microsoft-com:office:office" xmlns:oel="http://schemas.microsoft.com/office/2019/extlst" xmlns:r="http://schemas.openxmlformats.org/officeDocument/2006/relationships" xmlns:m="http://schemas.openxmlformats.org/officeDocument/2006/math" xmlns:v="urn:schemas-microsoft-com:vml" xmlns:wp14="http://schemas.microsoft.com/office/word/2010/wordprocessingDrawing" xmlns:wp="http://schemas.openxmlformats.org/drawingml/2006/wordprocessingDrawing" xmlns:w10="urn:schemas-microsoft-com:office:word" xmlns:w="http://schemas.openxmlformats.org/wordprocessingml/2006/main" xmlns:w14="http://schemas.microsoft.com/office/word/2010/wordml" xmlns:w15="http://schemas.microsoft.com/office/word/2012/wordml" xmlns:w16cei="http://schemas.microsoft.com/office/word/2026/wordml/cei" xmlns:w16cex="http://schemas.microsoft.com/office/word/2018/wordml/cex" xmlns:w16cid="http://schemas.microsoft.com/office/word/2016/wordml/cid" xmlns:w16="http://schemas.microsoft.com/office/word/2018/wordml" xmlns:w16du="http://schemas.microsoft.com/office/word/2023/wordml/word16du" xmlns:w16sdtdh="http://schemas.microsoft.com/office/word/2020/wordml/sdtdatahash" xmlns:w16sdtfl="http://schemas.microsoft.com/office/word/2024/wordml/sdtformatlock" xmlns:w16se="http://schemas.microsoft.com/office/word/2015/wordml/symex" xmlns:wpg="http://schemas.microsoft.com/office/word/2010/wordprocessingGroup" xmlns:wpi="http://schemas.microsoft.com/office/word/2010/wordprocessingInk" xmlns:wne="http://schemas.microsoft.com/office/word/2006/wordml" xmlns:wps="http://schemas.microsoft.com/office/word/2010/wordprocessingShape" mc:Ignorable="w14 w15 w16se w16cid w16 w16cex w16sdtdh w16sdtfl w16du wp14">
   <w:footnote w:type="separator" w:id="-1">
     <w:p>
       <w:pPr>
@@ -3347,7 +4098,7 @@
 </file>
 
 <file path=word/numbering.xml><?xml version="1.0" encoding="utf-8"?>
-<w:numbering xmlns:wpc="http://schemas.microsoft.com/office/word/2010/wordprocessingCanvas" xmlns:cx="http://schemas.microsoft.com/office/drawing/2014/chartex" xmlns:cx1="http://schemas.microsoft.com/office/drawing/2015/9/8/chartex" xmlns:cx2="http://schemas.microsoft.com/office/drawing/2015/10/21/chartex" xmlns:cx3="http://schemas.microsoft.com/office/drawing/2016/5/9/chartex" xmlns:cx4="http://schemas.microsoft.com/office/drawing/2016/5/10/chartex" xmlns:cx5="http://schemas.microsoft.com/office/drawing/2016/5/11/chartex" xmlns:cx6="http://schemas.microsoft.com/office/drawing/2016/5/12/chartex" xmlns:cx7="http://schemas.microsoft.com/office/drawing/2016/5/13/chartex" xmlns:cx8="http://schemas.microsoft.com/office/drawing/2016/5/14/chartex" xmlns:mc="http://schemas.openxmlformats.org/markup-compatibility/2006" xmlns:aink="http://schemas.microsoft.com/office/drawing/2016/ink" xmlns:am3d="http://schemas.microsoft.com/office/drawing/2017/model3d" xmlns:o="urn:schemas-microsoft-com:office:office" xmlns:oel="http://schemas.microsoft.com/office/2019/extlst" xmlns:r="http://schemas.openxmlformats.org/officeDocument/2006/relationships" xmlns:m="http://schemas.openxmlformats.org/officeDocument/2006/math" xmlns:v="urn:schemas-microsoft-com:vml" xmlns:wp14="http://schemas.microsoft.com/office/word/2010/wordprocessingDrawing" xmlns:wp="http://schemas.openxmlformats.org/drawingml/2006/wordprocessingDrawing" xmlns:w10="urn:schemas-microsoft-com:office:word" xmlns:w="http://schemas.openxmlformats.org/wordprocessingml/2006/main" xmlns:w14="http://schemas.microsoft.com/office/word/2010/wordml" xmlns:w15="http://schemas.microsoft.com/office/word/2012/wordml" xmlns:w16cex="http://schemas.microsoft.com/office/word/2018/wordml/cex" xmlns:w16cid="http://schemas.microsoft.com/office/word/2016/wordml/cid" xmlns:w16="http://schemas.microsoft.com/office/word/2018/wordml" xmlns:w16du="http://schemas.microsoft.com/office/word/2023/wordml/word16du" xmlns:w16sdtdh="http://schemas.microsoft.com/office/word/2020/wordml/sdtdatahash" xmlns:w16sdtfl="http://schemas.microsoft.com/office/word/2024/wordml/sdtformatlock" xmlns:w16se="http://schemas.microsoft.com/office/word/2015/wordml/symex" xmlns:wpg="http://schemas.microsoft.com/office/word/2010/wordprocessingGroup" xmlns:wpi="http://schemas.microsoft.com/office/word/2010/wordprocessingInk" xmlns:wne="http://schemas.microsoft.com/office/word/2006/wordml" xmlns:wps="http://schemas.microsoft.com/office/word/2010/wordprocessingShape" mc:Ignorable="w14 w15 w16se w16cid w16 w16cex w16sdtdh w16sdtfl w16du wp14">
+<w:numbering xmlns:wpc="http://schemas.microsoft.com/office/word/2010/wordprocessingCanvas" xmlns:cx="http://schemas.microsoft.com/office/drawing/2014/chartex" xmlns:cx1="http://schemas.microsoft.com/office/drawing/2015/9/8/chartex" xmlns:cx2="http://schemas.microsoft.com/office/drawing/2015/10/21/chartex" xmlns:cx3="http://schemas.microsoft.com/office/drawing/2016/5/9/chartex" xmlns:cx4="http://schemas.microsoft.com/office/drawing/2016/5/10/chartex" xmlns:cx5="http://schemas.microsoft.com/office/drawing/2016/5/11/chartex" xmlns:cx6="http://schemas.microsoft.com/office/drawing/2016/5/12/chartex" xmlns:cx7="http://schemas.microsoft.com/office/drawing/2016/5/13/chartex" xmlns:cx8="http://schemas.microsoft.com/office/drawing/2016/5/14/chartex" xmlns:mc="http://schemas.openxmlformats.org/markup-compatibility/2006" xmlns:aink="http://schemas.microsoft.com/office/drawing/2016/ink" xmlns:am3d="http://schemas.microsoft.com/office/drawing/2017/model3d" xmlns:o="urn:schemas-microsoft-com:office:office" xmlns:oel="http://schemas.microsoft.com/office/2019/extlst" xmlns:r="http://schemas.openxmlformats.org/officeDocument/2006/relationships" xmlns:m="http://schemas.openxmlformats.org/officeDocument/2006/math" xmlns:v="urn:schemas-microsoft-com:vml" xmlns:wp14="http://schemas.microsoft.com/office/word/2010/wordprocessingDrawing" xmlns:wp="http://schemas.openxmlformats.org/drawingml/2006/wordprocessingDrawing" xmlns:w10="urn:schemas-microsoft-com:office:word" xmlns:w="http://schemas.openxmlformats.org/wordprocessingml/2006/main" xmlns:w14="http://schemas.microsoft.com/office/word/2010/wordml" xmlns:w15="http://schemas.microsoft.com/office/word/2012/wordml" xmlns:w16cei="http://schemas.microsoft.com/office/word/2026/wordml/cei" xmlns:w16cex="http://schemas.microsoft.com/office/word/2018/wordml/cex" xmlns:w16cid="http://schemas.microsoft.com/office/word/2016/wordml/cid" xmlns:w16="http://schemas.microsoft.com/office/word/2018/wordml" xmlns:w16du="http://schemas.microsoft.com/office/word/2023/wordml/word16du" xmlns:w16sdtdh="http://schemas.microsoft.com/office/word/2020/wordml/sdtdatahash" xmlns:w16sdtfl="http://schemas.microsoft.com/office/word/2024/wordml/sdtformatlock" xmlns:w16se="http://schemas.microsoft.com/office/word/2015/wordml/symex" xmlns:wpg="http://schemas.microsoft.com/office/word/2010/wordprocessingGroup" xmlns:wpi="http://schemas.microsoft.com/office/word/2010/wordprocessingInk" xmlns:wne="http://schemas.microsoft.com/office/word/2006/wordml" xmlns:wps="http://schemas.microsoft.com/office/word/2010/wordprocessingShape" mc:Ignorable="w14 w15 w16se w16cid w16 w16cex w16sdtdh w16sdtfl w16du wp14">
   <w:abstractNum w:abstractNumId="0" w15:restartNumberingAfterBreak="0">
     <w:nsid w:val="FFFFFF7C"/>
     <w:multiLevelType w:val="singleLevel"/>
@@ -3930,7 +4681,7 @@
   <w:style w:type="paragraph" w:default="1" w:styleId="Normal">
     <w:name w:val="Normal"/>
     <w:qFormat/>
-    <w:rsid w:val="00FC693F"/>
+    <w:rsid w:val="00694A4C"/>
     <w:pPr>
       <w:spacing w:after="0"/>
     </w:pPr>

</xml_diff>